<commit_message>
Memoria revisada a fondo: estructura de la plantilla, cronograma, presupuesto y referencias completas
Capítulo 1 en una página; capítulo 2 con estado del arte, contexto y planteamiento
del problema; objetivos específicos con verbo; tabla resumen con los campos de la
plantilla; cronograma como figura; presupuesto en el formato de la plantilla con
todos los recursos; citas de Tree-sitter, Sled, ONNX Runtime, llama.cpp y Qwen3;
autores completados en las referencias arXiv que no los tenían.

Exportador: negritas y cursivas (familia tipográfica), títulos sin huérfanos,
DejaVu Sans Mono para las ecuaciones del anexo y emojis retirados sin romper el
marcado. Anexo A con títulos de referencias y cuestiones abiertas neutros.

Co-Authored-By: Claude Fable 5.1 <noreply@anthropic.com>
</commit_message>
<xml_diff>
--- a/memoria/Memoria TFM - Quirón.docx
+++ b/memoria/Memoria TFM - Quirón.docx
@@ -289,7 +289,7 @@
           <w:b w:val="0"/>
           <w:i w:val="0"/>
         </w:rPr>
-        <w:t>La aportación consiste en integrar ese recorrido con el editor, con la descarga y selección de modelos compatibles y con distintas conexiones a asistentes (Claude, Codex, servidores compatibles con OpenAI y Ollama). El entrenamiento de una red propia, previsto en el planteamiento inicial, quedó fuera del alcance final por razones de recursos, plazo y prioridad de validación, y se documenta como estudio de alternativas. Las evidencias registradas incluyen indexación incremental, aislamiento entre proyectos, cambios, borrados y uso de herramientas mediante proveedores reales y simulados, junto con una evaluación exploratoria de localización. También muestran limitaciones de fidelidad en los resúmenes generados. La evaluación disponible acredita un prototipo funcional; no permite afirmar todavía ahorro de tokens en tareas completas, prevención de duplicados ni análisis exhaustivo de dependencias.</w:t>
+        <w:t>La aportación consiste en integrar ese recorrido con el editor, con la descarga y selección de modelos compatibles y con distintas conexiones a asistentes (Claude, Codex, servidores compatibles con OpenAI y Ollama). El entrenamiento de una red propia, previsto en el planteamiento inicial, quedó fuera del alcance final por razones de recursos, plazo y prioridad de validación, y se documenta como estudio de alternativas. Las evidencias registradas cubren indexación incremental, aislamiento entre proyectos, cambios, borrados, uso de herramientas con proveedores reales y simulados y una evaluación exploratoria de localización; también muestran limitaciones de fidelidad en los resúmenes generados. La evaluación acredita un prototipo funcional; no permite afirmar todavía ahorro de tokens en tareas completas, prevención de duplicados ni análisis exhaustivo de dependencias.</w:t>
       </w:r>
     </w:p>
     <w:p>
@@ -474,7 +474,7 @@
                 <w:i w:val="0"/>
                 <w:sz w:val="18"/>
               </w:rPr>
-              <w:t>Título</w:t>
+              <w:t>Título del proyecto</w:t>
             </w:r>
           </w:p>
         </w:tc>
@@ -506,7 +506,7 @@
                 <w:i w:val="0"/>
                 <w:sz w:val="18"/>
               </w:rPr>
-              <w:t>Director/a</w:t>
+              <w:t>Directores del proyecto</w:t>
             </w:r>
           </w:p>
         </w:tc>
@@ -538,7 +538,7 @@
                 <w:i w:val="0"/>
                 <w:sz w:val="18"/>
               </w:rPr>
-              <w:t>Colaboración con empresa</w:t>
+              <w:t>El proyecto se ha realizado en colaboración de una empresa o a petición de una empresa</w:t>
             </w:r>
           </w:p>
         </w:tc>
@@ -553,7 +553,7 @@
                 <w:i w:val="0"/>
                 <w:sz w:val="18"/>
               </w:rPr>
-              <w:t>No</w:t>
+              <w:t>NO</w:t>
             </w:r>
           </w:p>
         </w:tc>
@@ -570,7 +570,7 @@
                 <w:i w:val="0"/>
                 <w:sz w:val="18"/>
               </w:rPr>
-              <w:t>Producto implementado</w:t>
+              <w:t>El proyecto ha implementado un producto</w:t>
             </w:r>
           </w:p>
         </w:tc>
@@ -585,7 +585,7 @@
                 <w:i w:val="0"/>
                 <w:sz w:val="18"/>
               </w:rPr>
-              <w:t>Sí: prototipo de editor nativo con índice de código local</w:t>
+              <w:t>SÍ: prototipo de editor nativo con índice de código local</w:t>
             </w:r>
           </w:p>
         </w:tc>
@@ -602,7 +602,7 @@
                 <w:i w:val="0"/>
                 <w:sz w:val="18"/>
               </w:rPr>
-              <w:t>Investigación o innovación</w:t>
+              <w:t>El proyecto ha consistido en el desarrollo de una investigación o innovación</w:t>
             </w:r>
           </w:p>
         </w:tc>
@@ -617,7 +617,7 @@
                 <w:i w:val="0"/>
                 <w:sz w:val="18"/>
               </w:rPr>
-              <w:t>Ingeniería aplicada y estudio de alternativas de modelos</w:t>
+              <w:t>NO: ingeniería aplicada; el estudio de alternativas del Anexo A no constituye una investigación experimental</w:t>
             </w:r>
           </w:p>
         </w:tc>
@@ -634,7 +634,7 @@
                 <w:i w:val="0"/>
                 <w:sz w:val="18"/>
               </w:rPr>
-              <w:t>Objetivo general</w:t>
+              <w:t>Objetivo general del proyecto</w:t>
             </w:r>
           </w:p>
         </w:tc>
@@ -649,7 +649,7 @@
                 <w:i w:val="0"/>
                 <w:sz w:val="18"/>
               </w:rPr>
-              <w:t>Integrar un índice consultable con fuentes comprobables y un worker local configurable dentro de un editor nativo</w:t>
+              <w:t>Construir y evaluar un prototipo de editor nativo que mantenga un índice de código mediante un worker local configurable y aporte al asistente referencias comprobables contra los archivos del proyecto</w:t>
             </w:r>
           </w:p>
         </w:tc>
@@ -708,16 +708,7 @@
           <w:b w:val="0"/>
           <w:i w:val="0"/>
         </w:rPr>
-        <w:t>Trabajar sobre proyectos grandes exige conocer qué contiene cada archivo y dónde se implementa cada responsabilidad. La experiencia de trabajo con asistentes de programación durante el máster puso de manifiesto tres problemas recurrentes: el asistente reescribe lógica que ya existe porque no la encuentra, interpreta mal el código por falta de contexto, y consume una parte considerable de su ventana de contexto en leer archivos que no necesita. De ahí surge la idea de un mapa persistente del proyecto que facilite localizar código existente y seleccionar contexto. Reducir esos problemas exige una evaluación específica y no se deduce de disponer de un índice, así que la memoria distingue en todo momento lo que se ha implementado y probado de lo que sigue siendo hipótesis.</w:t>
-      </w:r>
-    </w:p>
-    <w:p>
-      <w:r>
-        <w:rPr>
-          <w:b w:val="0"/>
-          <w:i w:val="0"/>
-        </w:rPr>
-        <w:t>Quirón separa el trabajo continuo de descripción y búsqueda del razonamiento que se pide al asistente. El procesamiento del índice se realiza en local, con modelos preentrenados que se ejecutan en el equipo del usuario. El asistente puede ser un proveedor remoto o un servidor compatible elegido por el usuario. La aplicación mantiene una relación explícita entre la ficha recuperada y el archivo que debe leerse para comprobarla.</w:t>
+        <w:t>Trabajar sobre proyectos grandes exige saber qué contiene cada archivo y dónde se implementa cada responsabilidad. La experiencia con asistentes de programación durante el máster mostró tres problemas recurrentes: el asistente reescribe lógica que ya existe porque no la encuentra, interpreta mal el código por falta de contexto y gasta buena parte de su ventana en leer archivos que no necesita. De ahí nace la idea de un mapa persistente del proyecto, mantenido en local, que facilite localizar código y seleccionar contexto.</w:t>
       </w:r>
     </w:p>
     <w:p>
@@ -738,7 +729,7 @@
           <w:b w:val="0"/>
           <w:i w:val="0"/>
         </w:rPr>
-        <w:t xml:space="preserve">La pregunta de implementación es la siguiente: </w:t>
+        <w:t xml:space="preserve">La pregunta de implementación es: </w:t>
       </w:r>
       <w:r>
         <w:rPr>
@@ -752,7 +743,7 @@
           <w:b w:val="0"/>
           <w:i w:val="0"/>
         </w:rPr>
-        <w:t xml:space="preserve"> La pregunta experimental adicional es si ese mapa mejora la localización y reduce el contexto necesario manteniendo la calidad de las respuestas. Ambas preguntas requieren evidencias distintas: integración funcional para la primera y comparación entre métodos para la segunda. Este trabajo responde a la primera y aporta una evaluación exploratoria de la segunda.</w:t>
+        <w:t xml:space="preserve"> La pregunta experimental es si ese mapa mejora la localización y reduce el contexto necesario sin perder calidad. Este trabajo, un desarrollo de producto sin colaboración empresarial, responde a la primera con un prototipo y aporta una evaluación exploratoria de la segunda.</w:t>
       </w:r>
     </w:p>
     <w:p>
@@ -773,7 +764,7 @@
           <w:b w:val="0"/>
           <w:i w:val="0"/>
         </w:rPr>
-        <w:t>El alcance final comprende el editor, la guardia de rutas, la indexación incremental, las fichas generadas mediante un modelo preentrenado, los embeddings, las proyecciones en Qdrant y Neo4j y la recuperación conectada al chat. La descarga y selección de modelos compatibles permite adaptar el worker al dispositivo. La evolución de los objetivos iniciales se documenta en el Capítulo 3 y en el apartado 4.2.8.</w:t>
+        <w:t>El alcance final comprende el editor con guardia de rutas, la indexación incremental con fichas de un modelo preentrenado y embeddings, las proyecciones en Qdrant y Neo4j, la recuperación conectada al chat y la selección de modelos para adaptar el worker al equipo; el Capítulo 3 detalla los objetivos y su evolución.</w:t>
       </w:r>
     </w:p>
     <w:p>
@@ -794,16 +785,7 @@
           <w:b w:val="0"/>
           <w:i w:val="0"/>
         </w:rPr>
-        <w:t>Se ha construido un prototipo funcional en el que abrir una carpeta produce, en segundo plano, un índice de fichas vectorizadas por proyecto que el chat consulta y devuelve como fuentes clicables. Las pruebas registradas muestran el funcionamiento del worker Qwen/BGE-M3 con Qdrant y Neo4j sobre proyectos sintéticos y sobre el propio repositorio de Quirón: apertura, consultas, cambios, retirada de unidades, exclusión de archivos sensibles y enlaces, y aislamiento entre proyectos. Hay evidencias de rondas completas desde la interfaz con Claude y con Codex, y pruebas de transporte con un servidor compatible simulado. Una evaluación exploratoria de localización sobre diez preguntas obtuvo el objetivo entre los cinco primeros resultados en todos los casos. Los resultados negativos del generador se conservaron para estudiar errores de contenido y truncamiento, y motivaron una versión de fichas con citas verificadas por el programa.</w:t>
-      </w:r>
-    </w:p>
-    <w:p>
-      <w:r>
-        <w:rPr>
-          <w:b w:val="0"/>
-          <w:i w:val="0"/>
-        </w:rPr>
-        <w:t>La revisión final del código encontró límites de integridad en el registro de eventos, en la resolución de llamadas y en la reconstrucción del índice de código, y llevó a corregir los dos primeros. El apartado 4.6 separa las evidencias de cada tipo.</w:t>
+        <w:t>Abrir una carpeta produce en segundo plano un índice de fichas vectorizadas por proyecto que el chat consulta y devuelve como fuentes clicables. Las pruebas registradas cubren apertura, consultas, cambios, borrados, exclusión de archivos sensibles y aislamiento entre proyectos, además de rondas completas desde la interfaz con Claude y Codex. En una evaluación exploratoria de localización con diez preguntas, el objetivo apareció entre los cinco primeros resultados en todos los casos. Los errores del generador se conservaron y motivaron fichas con citas verificadas por el programa; la revisión final corrigió la integridad del registro de eventos y documentó los límites restantes.</w:t>
       </w:r>
     </w:p>
     <w:p>
@@ -824,7 +806,7 @@
           <w:b w:val="0"/>
           <w:i w:val="0"/>
         </w:rPr>
-        <w:t>El Capítulo 2 presenta los antecedentes; el 3 fija los objetivos y los cambios de alcance; el 4 describe planificación, implementación y evaluación; el 5 discute los límites; el 6 presenta las conclusiones; el 7 recoge el trabajo futuro; el 8 contiene las referencias y el 9 identifica los anexos y las evidencias.</w:t>
+        <w:t>Los capítulos 2 a 9 presentan, por este orden, los antecedentes, los objetivos, el desarrollo y la evaluación, la discusión, las conclusiones, el trabajo futuro, las referencias y los anexos con las evidencias.</w:t>
       </w:r>
     </w:p>
     <w:p>
@@ -853,7 +835,28 @@
           <w:b w:val="0"/>
           <w:i w:val="0"/>
         </w:rPr>
-        <w:t>2.1 Recuperación de contexto en repositorios</w:t>
+        <w:t>2.1 Estado del arte</w:t>
+      </w:r>
+    </w:p>
+    <w:p>
+      <w:r>
+        <w:rPr>
+          <w:b w:val="0"/>
+          <w:i w:val="0"/>
+        </w:rPr>
+        <w:t>Los asistentes de programación necesitan recuperar del repositorio el contexto que no cabe en su ventana. La literatura analizada se organiza en tres frentes: la recuperación de contexto en repositorios, los modelos de representación y generación con sus almacenes, y las arquitecturas que se estudiaron para una red propia.</w:t>
+      </w:r>
+    </w:p>
+    <w:p>
+      <w:pPr>
+        <w:pStyle w:val="Heading3"/>
+      </w:pPr>
+      <w:r>
+        <w:rPr>
+          <w:b w:val="0"/>
+          <w:i w:val="0"/>
+        </w:rPr>
+        <w:t>2.1.1 Recuperación de contexto en repositorios</w:t>
       </w:r>
     </w:p>
     <w:p>
@@ -1129,14 +1132,14 @@
     </w:p>
     <w:p>
       <w:pPr>
-        <w:pStyle w:val="Heading2"/>
+        <w:pStyle w:val="Heading3"/>
       </w:pPr>
       <w:r>
         <w:rPr>
           <w:b w:val="0"/>
           <w:i w:val="0"/>
         </w:rPr>
-        <w:t>2.2 Representación, generación y almacenes</w:t>
+        <w:t>2.1.2 Representación, generación y almacenes</w:t>
       </w:r>
     </w:p>
     <w:p>
@@ -1164,6 +1167,45 @@
           <w:i w:val="0"/>
         </w:rPr>
         <w:t>Qdrant [17] almacena los vectores y permite restringir candidatos mediante filtros de carga útil. Neo4j [18] almacena nodos y relaciones consultables. La identidad de las unidades permite vincular ambas proyecciones. La existencia de un grafo no implica que sus relaciones resuelvan todos los tipos, importaciones o llamadas del programa.</w:t>
+      </w:r>
+    </w:p>
+    <w:p>
+      <w:pPr>
+        <w:pStyle w:val="Heading3"/>
+      </w:pPr>
+      <w:r>
+        <w:rPr>
+          <w:b w:val="0"/>
+          <w:i w:val="0"/>
+        </w:rPr>
+        <w:t>2.1.3 Alternativas para una red propia</w:t>
+      </w:r>
+    </w:p>
+    <w:p>
+      <w:r>
+        <w:rPr>
+          <w:b w:val="0"/>
+          <w:i w:val="0"/>
+        </w:rPr>
+        <w:t>El estudio inicial revisó MLA [1][2], atención dispersa [3], mecanismos lineales [4–7], mezcla de expertos [8][9], destilación [10–12c] y cuantización [20][21]. Su resultado se conserva en el Anexo A como exploración de alternativas. Ninguno de esos mecanismos se implementó como un nuevo backbone entrenado en este trabajo.</w:t>
+      </w:r>
+    </w:p>
+    <w:p>
+      <w:r>
+        <w:rPr>
+          <w:b w:val="0"/>
+          <w:i w:val="0"/>
+        </w:rPr>
+        <w:t>La recurrencia de estado fijo puede tener coste constante por paso respecto a la longitud del contexto, para dimensiones fijas. Esta propiedad no se extiende al modelo completo si se añaden capas de atención completa sobre todo el historial. La exportación y el rendimiento de una arquitectura híbrida en ONNX/Rust quedaron como cuestiones por medir.</w:t>
+      </w:r>
+    </w:p>
+    <w:p>
+      <w:r>
+        <w:rPr>
+          <w:b w:val="0"/>
+          <w:i w:val="0"/>
+        </w:rPr>
+        <w:t>Sequence-Level KD [11] permite utilizar respuestas textuales de un profesor. QLoRA [24] muestra que es posible ajustar modelos preentrenados reduciendo el consumo de memoria. La decisión de no entrenar en esta versión es de alcance y viabilidad; no supone que cualquier ajuste resulte imposible con el equipo disponible.</w:t>
       </w:r>
     </w:p>
     <w:p>
@@ -1175,7 +1217,7 @@
           <w:b w:val="0"/>
           <w:i w:val="0"/>
         </w:rPr>
-        <w:t>2.3 Estudio de alternativas para la red obrera</w:t>
+        <w:t>2.2 Contexto y justificación</w:t>
       </w:r>
     </w:p>
     <w:p>
@@ -1184,25 +1226,7 @@
           <w:b w:val="0"/>
           <w:i w:val="0"/>
         </w:rPr>
-        <w:t>El estudio inicial revisó MLA [1][2], atención dispersa [3], mecanismos lineales [4–7], mezcla de expertos [8][9], destilación [10–12c] y cuantización [20][21]. Su resultado se conserva en el Anexo A como exploración de alternativas. Ninguno de esos mecanismos se implementó como un nuevo backbone entrenado en este trabajo.</w:t>
-      </w:r>
-    </w:p>
-    <w:p>
-      <w:r>
-        <w:rPr>
-          <w:b w:val="0"/>
-          <w:i w:val="0"/>
-        </w:rPr>
-        <w:t>La recurrencia de estado fijo puede tener coste constante por paso respecto a la longitud del contexto, para dimensiones fijas. Esta propiedad no se extiende al modelo completo si se añaden capas de atención completa sobre todo el historial. La exportación y el rendimiento de una arquitectura híbrida en ONNX/Rust quedaron como cuestiones por medir.</w:t>
-      </w:r>
-    </w:p>
-    <w:p>
-      <w:r>
-        <w:rPr>
-          <w:b w:val="0"/>
-          <w:i w:val="0"/>
-        </w:rPr>
-        <w:t>Sequence-Level KD [11] permite utilizar respuestas textuales de un profesor. QLoRA [24] muestra que es posible ajustar modelos preentrenados reduciendo el consumo de memoria. La decisión de no entrenar en esta versión es de alcance y viabilidad; no supone que cualquier ajuste resulte imposible con el equipo disponible.</w:t>
+        <w:t>El proyecto nace de la práctica diaria con asistentes de programación sobre repositorios propios de tamaño medio, y su aplicabilidad prevista es el uso individual de un desarrollador en su equipo: el índice se construye y se consulta en local, y el asistente puede ser cualquiera de los proveedores admitidos. Se busca facilitar la navegación por responsabilidades del código, conservar referencias comprobables y adaptar la inferencia al equipo del usuario. El ahorro económico y la prevención de lógica duplicada permanecen como hipótesis de aplicación. El cómputo local tiene costes de descarga, almacenamiento, memoria, energía y mantenimiento; disponer del hardware no los elimina. Las suscripciones y las conexiones por API son vías de acceso diferentes, con condiciones y límites propios.</w:t>
       </w:r>
     </w:p>
     <w:p>
@@ -1214,7 +1238,7 @@
           <w:b w:val="0"/>
           <w:i w:val="0"/>
         </w:rPr>
-        <w:t>2.4 Justificación del proyecto</w:t>
+        <w:t>2.3 Planteamiento del problema</w:t>
       </w:r>
     </w:p>
     <w:p>
@@ -1223,7 +1247,7 @@
           <w:b w:val="0"/>
           <w:i w:val="0"/>
         </w:rPr>
-        <w:t>Se busca facilitar la navegación por responsabilidades del código, conservar referencias comprobables y adaptar la inferencia al equipo del usuario. El ahorro económico y la prevención de lógica duplicada permanecen como hipótesis de aplicación. El cómputo local tiene costes de descarga, almacenamiento, memoria, energía y mantenimiento; disponer del hardware no los elimina. Las suscripciones y las conexiones por API son vías de acceso diferentes, con condiciones y límites propios.</w:t>
+        <w:t>Los sistemas revisados resuelven la recuperación desde el lado del agente o de la herramienta de completado: construyen el contexto por petición, sobre un repositorio que tratan como estático, y no ofrecen al usuario un mapa persistente que evolucione con el código ni una comprobación de que lo recuperado sigue vigente. Tampoco separan el trabajo continuo de descripción, que puede asumir un modelo pequeño en local, del razonamiento que se pide a un modelo grande. La necesidad detectada es un componente que viva en el editor, mantenga el índice mientras se trabaja, aísle cada proyecto y entregue referencias verificables. De esa necesidad se derivan los objetivos del Capítulo 3.</w:t>
       </w:r>
     </w:p>
     <w:p>
@@ -1252,7 +1276,7 @@
           <w:b w:val="0"/>
           <w:i w:val="0"/>
         </w:rPr>
-        <w:t>3.1 Objetivo general y evolución del alcance</w:t>
+        <w:t>3.1 Objetivo general</w:t>
       </w:r>
     </w:p>
     <w:p>
@@ -1261,7 +1285,7 @@
           <w:b w:val="0"/>
           <w:i w:val="0"/>
         </w:rPr>
-        <w:t xml:space="preserve">El objetivo general es </w:t>
+        <w:t xml:space="preserve">El objetivo general del presente trabajo es </w:t>
       </w:r>
       <w:r>
         <w:rPr>
@@ -1287,7 +1311,7 @@
           <w:b w:val="0"/>
           <w:i w:val="0"/>
         </w:rPr>
-        <w:t>3.2 Objetivos específicos y estado</w:t>
+        <w:t>3.2 Objetivos específicos</w:t>
       </w:r>
     </w:p>
     <w:tbl>
@@ -1375,7 +1399,7 @@
                 <w:i w:val="0"/>
                 <w:sz w:val="18"/>
               </w:rPr>
-              <w:t>Registro inmutable y dos proyecciones reconstruibles desde él</w:t>
+              <w:t>Construir un registro inmutable de eventos y dos proyecciones reconstruibles desde él</w:t>
             </w:r>
           </w:p>
         </w:tc>
@@ -1422,7 +1446,7 @@
                 <w:i w:val="0"/>
                 <w:sz w:val="18"/>
               </w:rPr>
-              <w:t>Editor con confinamiento al proyecto</w:t>
+              <w:t>Desarrollar un editor nativo confinado al proyecto abierto</w:t>
             </w:r>
           </w:p>
         </w:tc>
@@ -1469,7 +1493,7 @@
                 <w:i w:val="0"/>
                 <w:sz w:val="18"/>
               </w:rPr>
-              <w:t>Indexador incremental de Archivo, Lógica y Cambio</w:t>
+              <w:t>Implementar un indexador incremental de unidades Archivo, Lógica y Cambio</w:t>
             </w:r>
           </w:p>
         </w:tc>
@@ -1516,7 +1540,7 @@
                 <w:i w:val="0"/>
                 <w:sz w:val="18"/>
               </w:rPr>
-              <w:t>Grafo de dependencias resuelto por análisis estático</w:t>
+              <w:t>Construir un grafo de dependencias resuelto por análisis estático</w:t>
             </w:r>
           </w:p>
         </w:tc>
@@ -1563,7 +1587,7 @@
                 <w:i w:val="0"/>
                 <w:sz w:val="18"/>
               </w:rPr>
-              <w:t>Vector, expansión, reranker y presupuesto de contexto</w:t>
+              <w:t>Recuperar contexto por vector, expansión por grafo, reranker y presupuesto de tokens</w:t>
             </w:r>
           </w:p>
         </w:tc>
@@ -1610,7 +1634,7 @@
                 <w:i w:val="0"/>
                 <w:sz w:val="18"/>
               </w:rPr>
-              <w:t>Estudiar mecanismos para una red propia exportable</w:t>
+              <w:t>Estudiar mecanismos para una red propia exportable a ONNX</w:t>
             </w:r>
           </w:p>
         </w:tc>
@@ -1657,7 +1681,7 @@
                 <w:i w:val="0"/>
                 <w:sz w:val="18"/>
               </w:rPr>
-              <w:t>Entrenar por destilación y desplegar una red propia</w:t>
+              <w:t>Entrenar por destilación y desplegar una red propia como worker</w:t>
             </w:r>
           </w:p>
         </w:tc>
@@ -1704,7 +1728,7 @@
                 <w:i w:val="0"/>
                 <w:sz w:val="18"/>
               </w:rPr>
-              <w:t>Medir ahorro, recuperación, aislamiento y fidelidad</w:t>
+              <w:t>Medir ahorro de contexto, recuperación, aislamiento y fidelidad</w:t>
             </w:r>
           </w:p>
         </w:tc>
@@ -1752,7 +1776,7 @@
           <w:b w:val="0"/>
           <w:i w:val="0"/>
         </w:rPr>
-        <w:t>3.3 Beneficios previstos y límites de la aportación</w:t>
+        <w:t>3.3 Beneficios del proyecto</w:t>
       </w:r>
     </w:p>
     <w:p>
@@ -2115,6 +2139,72 @@
       </w:r>
     </w:p>
     <w:p>
+      <w:pPr>
+        <w:jc w:val="center"/>
+      </w:pPr>
+      <w:r>
+        <w:drawing>
+          <wp:inline xmlns:a="http://schemas.openxmlformats.org/drawingml/2006/main" xmlns:pic="http://schemas.openxmlformats.org/drawingml/2006/picture">
+            <wp:extent cx="5580000" cy="2695449"/>
+            <wp:docPr id="1" name="Picture 1"/>
+            <wp:cNvGraphicFramePr>
+              <a:graphicFrameLocks noChangeAspect="1"/>
+            </wp:cNvGraphicFramePr>
+            <a:graphic>
+              <a:graphicData uri="http://schemas.openxmlformats.org/drawingml/2006/picture">
+                <pic:pic>
+                  <pic:nvPicPr>
+                    <pic:cNvPr id="0" name="fig-cronograma.png"/>
+                    <pic:cNvPicPr/>
+                  </pic:nvPicPr>
+                  <pic:blipFill>
+                    <a:blip r:embed="rId11"/>
+                    <a:stretch>
+                      <a:fillRect/>
+                    </a:stretch>
+                  </pic:blipFill>
+                  <pic:spPr>
+                    <a:xfrm>
+                      <a:off x="0" y="0"/>
+                      <a:ext cx="5580000" cy="2695449"/>
+                    </a:xfrm>
+                    <a:prstGeom prst="rect"/>
+                  </pic:spPr>
+                </pic:pic>
+              </a:graphicData>
+            </a:graphic>
+          </wp:inline>
+        </w:drawing>
+      </w:r>
+    </w:p>
+    <w:p>
+      <w:pPr>
+        <w:pStyle w:val="Caption"/>
+        <w:jc w:val="center"/>
+      </w:pPr>
+      <w:r>
+        <w:t xml:space="preserve">Figura </w:t>
+      </w:r>
+      <w:r>
+        <w:fldChar w:fldCharType="begin"/>
+        <w:instrText xml:space="preserve">SEQ Figura \* ARABIC</w:instrText>
+        <w:fldChar w:fldCharType="separate"/>
+        <w:fldChar w:fldCharType="end"/>
+      </w:r>
+      <w:r>
+        <w:t>. Cronograma del proyecto: actividades realizadas entre febrero y septiembre de 2026</w:t>
+      </w:r>
+    </w:p>
+    <w:p>
+      <w:r>
+        <w:rPr>
+          <w:b w:val="0"/>
+          <w:i w:val="0"/>
+        </w:rPr>
+        <w:t>El esfuerzo total en horas se recoge en el presupuesto del apartado 4.4. El historial Git del repositorio de entrega comienza el 29 de agosto de 2026 con la reorganización documental del proyecto; el código anterior a esa fecha se incorporó en ese primer commit.</w:t>
+      </w:r>
+    </w:p>
+    <w:p>
       <w:r>
         <w:rPr>
           <w:b w:val="0"/>
@@ -2203,7 +2293,7 @@
           <w:b w:val="0"/>
           <w:i w:val="0"/>
         </w:rPr>
-        <w:t>Quirón se compone de cuatro piezas: el editor nativo, el cerebro (índice, registro de eventos y API local), la pasarela hacia los asistentes y el vectorizador local. La figura resume los componentes y los flujos de datos entre ellos.</w:t>
+        <w:t>Quirón se compone de cuatro piezas: el editor nativo, el cerebro (índice, registro de eventos y API local), la pasarela hacia los asistentes y el vectorizador local. En esta memoria «worker» designa el proceso del cerebro que mantiene el índice; en la interfaz aparece como «vectorizador», y el modelo Qwen que redacta las fichas es su generador. La figura resume los componentes y los flujos de datos entre ellos.</w:t>
       </w:r>
     </w:p>
     <w:p>
@@ -2214,7 +2304,7 @@
         <w:drawing>
           <wp:inline xmlns:a="http://schemas.openxmlformats.org/drawingml/2006/main" xmlns:pic="http://schemas.openxmlformats.org/drawingml/2006/picture">
             <wp:extent cx="5580000" cy="3475908"/>
-            <wp:docPr id="1" name="Picture 1"/>
+            <wp:docPr id="2" name="Picture 2"/>
             <wp:cNvGraphicFramePr>
               <a:graphicFrameLocks noChangeAspect="1"/>
             </wp:cNvGraphicFramePr>
@@ -2226,7 +2316,7 @@
                     <pic:cNvPicPr/>
                   </pic:nvPicPr>
                   <pic:blipFill>
-                    <a:blip r:embed="rId11"/>
+                    <a:blip r:embed="rId12"/>
                     <a:stretch>
                       <a:fillRect/>
                     </a:stretch>
@@ -2281,7 +2371,7 @@
           <w:b w:val="0"/>
           <w:i w:val="0"/>
         </w:rPr>
-        <w:t xml:space="preserve">El cerebro utiliza Sled como almacenamiento local; el nombre histórico del módulo </w:t>
+        <w:t xml:space="preserve">El cerebro utiliza Sled [32] como almacenamiento local; el nombre histórico del módulo </w:t>
       </w:r>
       <w:r>
         <w:rPr>
@@ -2407,7 +2497,7 @@
           <w:b w:val="0"/>
           <w:i w:val="0"/>
         </w:rPr>
-        <w:t>Se genera una unidad de archivo para las extensiones admitidas. Tree-sitter añade unidades de lógica Rust: funciones, métodos, estructuras, enumeraciones y traits, con firma y líneas. La cobertura no incluye toda construcción del lenguaje, y los demás lenguajes tienen por ahora ficha de archivo.</w:t>
+        <w:t>Se genera una unidad de archivo para las extensiones admitidas. Tree-sitter [31] añade unidades de lógica Rust: funciones, métodos, estructuras, enumeraciones y traits, con firma y líneas. La cobertura no incluye toda construcción del lenguaje, y los demás lenguajes tienen por ahora ficha de archivo.</w:t>
       </w:r>
     </w:p>
     <w:p>
@@ -2466,275 +2556,7 @@
           <w:b w:val="0"/>
           <w:i w:val="0"/>
         </w:rPr>
-        <w:t>BGE-M3 vectoriza ruta, símbolo, firma y descripción. La ficha mantiene la relación con el archivo sin copiar todo su código al texto del vector. El extractor calcula además una huella del cuerpo normalizado por espacios, pero no existe un comparador automático de duplicados conectado a esa huella.</w:t>
-      </w:r>
-    </w:p>
-    <w:p>
-      <w:pPr>
-        <w:jc w:val="center"/>
-      </w:pPr>
-      <w:r>
-        <w:drawing>
-          <wp:inline xmlns:a="http://schemas.openxmlformats.org/drawingml/2006/main" xmlns:pic="http://schemas.openxmlformats.org/drawingml/2006/picture">
-            <wp:extent cx="5580000" cy="3138750"/>
-            <wp:docPr id="2" name="Picture 2"/>
-            <wp:cNvGraphicFramePr>
-              <a:graphicFrameLocks noChangeAspect="1"/>
-            </wp:cNvGraphicFramePr>
-            <a:graphic>
-              <a:graphicData uri="http://schemas.openxmlformats.org/drawingml/2006/picture">
-                <pic:pic>
-                  <pic:nvPicPr>
-                    <pic:cNvPr id="0" name="fig-vectorizado.png"/>
-                    <pic:cNvPicPr/>
-                  </pic:nvPicPr>
-                  <pic:blipFill>
-                    <a:blip r:embed="rId12"/>
-                    <a:stretch>
-                      <a:fillRect/>
-                    </a:stretch>
-                  </pic:blipFill>
-                  <pic:spPr>
-                    <a:xfrm>
-                      <a:off x="0" y="0"/>
-                      <a:ext cx="5580000" cy="3138750"/>
-                    </a:xfrm>
-                    <a:prstGeom prst="rect"/>
-                  </pic:spPr>
-                </pic:pic>
-              </a:graphicData>
-            </a:graphic>
-          </wp:inline>
-        </w:drawing>
-      </w:r>
-    </w:p>
-    <w:p>
-      <w:pPr>
-        <w:pStyle w:val="Caption"/>
-        <w:jc w:val="center"/>
-      </w:pPr>
-      <w:r>
-        <w:t xml:space="preserve">Figura </w:t>
-      </w:r>
-      <w:r>
-        <w:fldChar w:fldCharType="begin"/>
-        <w:instrText xml:space="preserve">SEQ Figura \* ARABIC</w:instrText>
-        <w:fldChar w:fldCharType="separate"/>
-        <w:fldChar w:fldCharType="end"/>
-      </w:r>
-      <w:r>
-        <w:t>. Pantalla de vectorización al abrir un proyecto: el editor muestra el progreso del worker y queda vigilando cambios</w:t>
-      </w:r>
-    </w:p>
-    <w:p>
-      <w:pPr>
-        <w:pStyle w:val="Heading3"/>
-      </w:pPr>
-      <w:r>
-        <w:rPr>
-          <w:b w:val="0"/>
-          <w:i w:val="0"/>
-        </w:rPr>
-        <w:t>4.2.4 Grafo y recuperación</w:t>
-      </w:r>
-    </w:p>
-    <w:p>
-      <w:r>
-        <w:rPr>
-          <w:b w:val="0"/>
-          <w:i w:val="0"/>
-        </w:rPr>
-        <w:t xml:space="preserve">Neo4j contiene los nodos </w:t>
-      </w:r>
-      <w:r>
-        <w:rPr>
-          <w:rFonts w:ascii="Consolas" w:hAnsi="Consolas"/>
-          <w:b w:val="0"/>
-          <w:i w:val="0"/>
-          <w:sz w:val="18"/>
-        </w:rPr>
-        <w:t>CodeProject</w:t>
-      </w:r>
-      <w:r>
-        <w:rPr>
-          <w:b w:val="0"/>
-          <w:i w:val="0"/>
-        </w:rPr>
-        <w:t xml:space="preserve"> y </w:t>
-      </w:r>
-      <w:r>
-        <w:rPr>
-          <w:rFonts w:ascii="Consolas" w:hAnsi="Consolas"/>
-          <w:b w:val="0"/>
-          <w:i w:val="0"/>
-          <w:sz w:val="18"/>
-        </w:rPr>
-        <w:t>CodeUnit</w:t>
-      </w:r>
-      <w:r>
-        <w:rPr>
-          <w:b w:val="0"/>
-          <w:i w:val="0"/>
-        </w:rPr>
-        <w:t xml:space="preserve"> y las relaciones </w:t>
-      </w:r>
-      <w:r>
-        <w:rPr>
-          <w:rFonts w:ascii="Consolas" w:hAnsi="Consolas"/>
-          <w:b w:val="0"/>
-          <w:i w:val="0"/>
-          <w:sz w:val="18"/>
-        </w:rPr>
-        <w:t>HAS_UNIT</w:t>
-      </w:r>
-      <w:r>
-        <w:rPr>
-          <w:b w:val="0"/>
-          <w:i w:val="0"/>
-        </w:rPr>
-        <w:t xml:space="preserve">, </w:t>
-      </w:r>
-      <w:r>
-        <w:rPr>
-          <w:rFonts w:ascii="Consolas" w:hAnsi="Consolas"/>
-          <w:b w:val="0"/>
-          <w:i w:val="0"/>
-          <w:sz w:val="18"/>
-        </w:rPr>
-        <w:t>DEFINED_IN</w:t>
-      </w:r>
-      <w:r>
-        <w:rPr>
-          <w:b w:val="0"/>
-          <w:i w:val="0"/>
-        </w:rPr>
-        <w:t xml:space="preserve"> y </w:t>
-      </w:r>
-      <w:r>
-        <w:rPr>
-          <w:rFonts w:ascii="Consolas" w:hAnsi="Consolas"/>
-          <w:b w:val="0"/>
-          <w:i w:val="0"/>
-          <w:sz w:val="18"/>
-        </w:rPr>
-        <w:t>CALLS</w:t>
-      </w:r>
-      <w:r>
-        <w:rPr>
-          <w:b w:val="0"/>
-          <w:i w:val="0"/>
-        </w:rPr>
-        <w:t>. Las llamadas se extraen sintácticamente y se enlazan mediante reglas por nombre y archivo. Se omiten los casos ambiguos según esas reglas, pero una coincidencia única de nombre no prueba la resolución semántica del destino: se pierden determinados prefijos de módulo y no se resuelve el tipo del receptor. No se ofrecen garantías de análisis de impacto completo.</w:t>
-      </w:r>
-    </w:p>
-    <w:p>
-      <w:r>
-        <w:rPr>
-          <w:b w:val="0"/>
-          <w:i w:val="0"/>
-        </w:rPr>
-        <w:t>La búsqueda de código aplica dentro de Qdrant filtros de proyecto y de versiones de modelos, y revalida ruta y hash antes de devolver cada acierto. Añade un vecino por llamadas cuando puede obtenerlo del grafo. La consulta de vecinos filtra explícitamente proyecto y versiones de modelos en la semilla y en el vecino, y conserva la ficha JSON y su indicador de entrada parcial; estas condiciones se comprobaron introduciendo aristas entre proyectos de contenido idéntico y nodos de versiones anteriores. No se ejecuta un reranker de fichas ni se aplica un presupuesto global medido con el tokenizador del asistente. La memoria de eventos utiliza otro recorrido, en el que parte del filtrado por proyecto sigue ocurriendo después de buscar; las garantías verificadas del índice de código no se extienden automáticamente a todos los endpoints.</w:t>
-      </w:r>
-    </w:p>
-    <w:p>
-      <w:pPr>
-        <w:pStyle w:val="Heading3"/>
-      </w:pPr>
-      <w:r>
-        <w:rPr>
-          <w:b w:val="0"/>
-          <w:i w:val="0"/>
-        </w:rPr>
-        <w:t>4.2.5 Editor y herramientas</w:t>
-      </w:r>
-    </w:p>
-    <w:p>
-      <w:r>
-        <w:rPr>
-          <w:b w:val="0"/>
-          <w:i w:val="0"/>
-        </w:rPr>
-        <w:t xml:space="preserve">El editor utiliza </w:t>
-      </w:r>
-      <w:r>
-        <w:rPr>
-          <w:rFonts w:ascii="Consolas" w:hAnsi="Consolas"/>
-          <w:b w:val="0"/>
-          <w:i w:val="0"/>
-          <w:sz w:val="18"/>
-        </w:rPr>
-        <w:t>winit</w:t>
-      </w:r>
-      <w:r>
-        <w:rPr>
-          <w:b w:val="0"/>
-          <w:i w:val="0"/>
-        </w:rPr>
-        <w:t xml:space="preserve">, </w:t>
-      </w:r>
-      <w:r>
-        <w:rPr>
-          <w:rFonts w:ascii="Consolas" w:hAnsi="Consolas"/>
-          <w:b w:val="0"/>
-          <w:i w:val="0"/>
-          <w:sz w:val="18"/>
-        </w:rPr>
-        <w:t>tiny-skia</w:t>
-      </w:r>
-      <w:r>
-        <w:rPr>
-          <w:b w:val="0"/>
-          <w:i w:val="0"/>
-        </w:rPr>
-        <w:t xml:space="preserve">, </w:t>
-      </w:r>
-      <w:r>
-        <w:rPr>
-          <w:rFonts w:ascii="Consolas" w:hAnsi="Consolas"/>
-          <w:b w:val="0"/>
-          <w:i w:val="0"/>
-          <w:sz w:val="18"/>
-        </w:rPr>
-        <w:t>softbuffer</w:t>
-      </w:r>
-      <w:r>
-        <w:rPr>
-          <w:b w:val="0"/>
-          <w:i w:val="0"/>
-        </w:rPr>
-        <w:t xml:space="preserve">, </w:t>
-      </w:r>
-      <w:r>
-        <w:rPr>
-          <w:rFonts w:ascii="Consolas" w:hAnsi="Consolas"/>
-          <w:b w:val="0"/>
-          <w:i w:val="0"/>
-          <w:sz w:val="18"/>
-        </w:rPr>
-        <w:t>taffy</w:t>
-      </w:r>
-      <w:r>
-        <w:rPr>
-          <w:b w:val="0"/>
-          <w:i w:val="0"/>
-        </w:rPr>
-        <w:t xml:space="preserve"> y </w:t>
-      </w:r>
-      <w:r>
-        <w:rPr>
-          <w:rFonts w:ascii="Consolas" w:hAnsi="Consolas"/>
-          <w:b w:val="0"/>
-          <w:i w:val="0"/>
-          <w:sz w:val="18"/>
-        </w:rPr>
-        <w:t>cosmic-text</w:t>
-      </w:r>
-      <w:r>
-        <w:rPr>
-          <w:b w:val="0"/>
-          <w:i w:val="0"/>
-        </w:rPr>
-        <w:t>, con las tipografías incluidas en el producto. Permite abrir proyectos, editar archivos y consultar el chat; muestra el estado del worker en el panel «Segundo plano» y las fuentes recibidas como enlaces al archivo y a la línea. La paleta «Agentes» integra la selección de proveedores y del modelo del worker, y el manual de uso se abre desde la propia aplicación.</w:t>
+        <w:t>BGE-M3 [19][29], ejecutado en proceso sobre ONNX Runtime [22], vectoriza ruta, símbolo, firma y descripción. La ficha mantiene la relación con el archivo sin copiar todo su código al texto del vector. El extractor calcula además una huella del cuerpo normalizado por espacios, pero no existe un comparador automático de duplicados conectado a esa huella.</w:t>
       </w:r>
     </w:p>
     <w:p>
@@ -2753,7 +2575,7 @@
               <a:graphicData uri="http://schemas.openxmlformats.org/drawingml/2006/picture">
                 <pic:pic>
                   <pic:nvPicPr>
-                    <pic:cNvPr id="0" name="fig-bienvenida.png"/>
+                    <pic:cNvPr id="0" name="fig-vectorizado.png"/>
                     <pic:cNvPicPr/>
                   </pic:nvPicPr>
                   <pic:blipFill>
@@ -2791,16 +2613,218 @@
         <w:fldChar w:fldCharType="end"/>
       </w:r>
       <w:r>
-        <w:t>. Pantalla de bienvenida del editor</w:t>
+        <w:t>. Pantalla de vectorización al abrir un proyecto: el editor muestra el progreso del worker y queda vigilando cambios</w:t>
       </w:r>
     </w:p>
     <w:p>
-      <w:r>
-        <w:rPr>
-          <w:b w:val="0"/>
-          <w:i w:val="0"/>
-        </w:rPr>
-        <w:t>Las herramientas ofrecidas al asistente son lectura de archivos, listado y búsqueda textual. Se ejecutan mediante la guardia del proyecto y con límites de tamaño de salida. Su existencia no implica edición autónoma ni que cada respuesta consulte todos los archivos pertinentes. Persisten carreras posibles entre inspeccionar una ruta y abrirla; el modelo de uso evaluado es un escritorio local de un solo usuario.</w:t>
+      <w:pPr>
+        <w:pStyle w:val="Heading3"/>
+      </w:pPr>
+      <w:r>
+        <w:rPr>
+          <w:b w:val="0"/>
+          <w:i w:val="0"/>
+        </w:rPr>
+        <w:t>4.2.4 Grafo y recuperación</w:t>
+      </w:r>
+    </w:p>
+    <w:p>
+      <w:r>
+        <w:rPr>
+          <w:b w:val="0"/>
+          <w:i w:val="0"/>
+        </w:rPr>
+        <w:t xml:space="preserve">Neo4j contiene los nodos </w:t>
+      </w:r>
+      <w:r>
+        <w:rPr>
+          <w:rFonts w:ascii="Consolas" w:hAnsi="Consolas"/>
+          <w:b w:val="0"/>
+          <w:i w:val="0"/>
+          <w:sz w:val="18"/>
+        </w:rPr>
+        <w:t>CodeProject</w:t>
+      </w:r>
+      <w:r>
+        <w:rPr>
+          <w:b w:val="0"/>
+          <w:i w:val="0"/>
+        </w:rPr>
+        <w:t xml:space="preserve"> y </w:t>
+      </w:r>
+      <w:r>
+        <w:rPr>
+          <w:rFonts w:ascii="Consolas" w:hAnsi="Consolas"/>
+          <w:b w:val="0"/>
+          <w:i w:val="0"/>
+          <w:sz w:val="18"/>
+        </w:rPr>
+        <w:t>CodeUnit</w:t>
+      </w:r>
+      <w:r>
+        <w:rPr>
+          <w:b w:val="0"/>
+          <w:i w:val="0"/>
+        </w:rPr>
+        <w:t xml:space="preserve"> y las relaciones </w:t>
+      </w:r>
+      <w:r>
+        <w:rPr>
+          <w:rFonts w:ascii="Consolas" w:hAnsi="Consolas"/>
+          <w:b w:val="0"/>
+          <w:i w:val="0"/>
+          <w:sz w:val="18"/>
+        </w:rPr>
+        <w:t>HAS_UNIT</w:t>
+      </w:r>
+      <w:r>
+        <w:rPr>
+          <w:b w:val="0"/>
+          <w:i w:val="0"/>
+        </w:rPr>
+        <w:t xml:space="preserve">, </w:t>
+      </w:r>
+      <w:r>
+        <w:rPr>
+          <w:rFonts w:ascii="Consolas" w:hAnsi="Consolas"/>
+          <w:b w:val="0"/>
+          <w:i w:val="0"/>
+          <w:sz w:val="18"/>
+        </w:rPr>
+        <w:t>DEFINED_IN</w:t>
+      </w:r>
+      <w:r>
+        <w:rPr>
+          <w:b w:val="0"/>
+          <w:i w:val="0"/>
+        </w:rPr>
+        <w:t xml:space="preserve"> y </w:t>
+      </w:r>
+      <w:r>
+        <w:rPr>
+          <w:rFonts w:ascii="Consolas" w:hAnsi="Consolas"/>
+          <w:b w:val="0"/>
+          <w:i w:val="0"/>
+          <w:sz w:val="18"/>
+        </w:rPr>
+        <w:t>CALLS</w:t>
+      </w:r>
+      <w:r>
+        <w:rPr>
+          <w:b w:val="0"/>
+          <w:i w:val="0"/>
+        </w:rPr>
+        <w:t>. Las llamadas se extraen sintácticamente y se enlazan mediante reglas por nombre y archivo. Se omiten los casos ambiguos según esas reglas, pero una coincidencia única de nombre no prueba la resolución semántica del destino: se pierden determinados prefijos de módulo y no se resuelve el tipo del receptor. No se ofrecen garantías de análisis de impacto completo.</w:t>
+      </w:r>
+    </w:p>
+    <w:p>
+      <w:r>
+        <w:rPr>
+          <w:b w:val="0"/>
+          <w:i w:val="0"/>
+        </w:rPr>
+        <w:t>La búsqueda de código aplica dentro de Qdrant filtros de proyecto y de versiones de modelos, y revalida ruta y hash antes de devolver cada acierto. Añade un vecino por llamadas cuando puede obtenerlo del grafo. La consulta de vecinos filtra explícitamente proyecto y versiones de modelos en la semilla y en el vecino, y conserva la ficha JSON y su indicador de entrada parcial; estas condiciones se comprobaron introduciendo aristas entre proyectos de contenido idéntico y nodos de versiones anteriores. No se ejecuta un reranker de fichas ni se aplica un presupuesto global medido con el tokenizador del asistente. La memoria de eventos utiliza otro recorrido, en el que parte del filtrado por proyecto sigue ocurriendo después de buscar; las garantías verificadas del índice de código no se extienden automáticamente a todos los endpoints.</w:t>
+      </w:r>
+    </w:p>
+    <w:p>
+      <w:pPr>
+        <w:pStyle w:val="Heading3"/>
+      </w:pPr>
+      <w:r>
+        <w:rPr>
+          <w:b w:val="0"/>
+          <w:i w:val="0"/>
+        </w:rPr>
+        <w:t>4.2.5 Editor y herramientas</w:t>
+      </w:r>
+    </w:p>
+    <w:p>
+      <w:r>
+        <w:rPr>
+          <w:b w:val="0"/>
+          <w:i w:val="0"/>
+        </w:rPr>
+        <w:t xml:space="preserve">El editor utiliza </w:t>
+      </w:r>
+      <w:r>
+        <w:rPr>
+          <w:rFonts w:ascii="Consolas" w:hAnsi="Consolas"/>
+          <w:b w:val="0"/>
+          <w:i w:val="0"/>
+          <w:sz w:val="18"/>
+        </w:rPr>
+        <w:t>winit</w:t>
+      </w:r>
+      <w:r>
+        <w:rPr>
+          <w:b w:val="0"/>
+          <w:i w:val="0"/>
+        </w:rPr>
+        <w:t xml:space="preserve">, </w:t>
+      </w:r>
+      <w:r>
+        <w:rPr>
+          <w:rFonts w:ascii="Consolas" w:hAnsi="Consolas"/>
+          <w:b w:val="0"/>
+          <w:i w:val="0"/>
+          <w:sz w:val="18"/>
+        </w:rPr>
+        <w:t>tiny-skia</w:t>
+      </w:r>
+      <w:r>
+        <w:rPr>
+          <w:b w:val="0"/>
+          <w:i w:val="0"/>
+        </w:rPr>
+        <w:t xml:space="preserve">, </w:t>
+      </w:r>
+      <w:r>
+        <w:rPr>
+          <w:rFonts w:ascii="Consolas" w:hAnsi="Consolas"/>
+          <w:b w:val="0"/>
+          <w:i w:val="0"/>
+          <w:sz w:val="18"/>
+        </w:rPr>
+        <w:t>softbuffer</w:t>
+      </w:r>
+      <w:r>
+        <w:rPr>
+          <w:b w:val="0"/>
+          <w:i w:val="0"/>
+        </w:rPr>
+        <w:t xml:space="preserve">, </w:t>
+      </w:r>
+      <w:r>
+        <w:rPr>
+          <w:rFonts w:ascii="Consolas" w:hAnsi="Consolas"/>
+          <w:b w:val="0"/>
+          <w:i w:val="0"/>
+          <w:sz w:val="18"/>
+        </w:rPr>
+        <w:t>taffy</w:t>
+      </w:r>
+      <w:r>
+        <w:rPr>
+          <w:b w:val="0"/>
+          <w:i w:val="0"/>
+        </w:rPr>
+        <w:t xml:space="preserve"> y </w:t>
+      </w:r>
+      <w:r>
+        <w:rPr>
+          <w:rFonts w:ascii="Consolas" w:hAnsi="Consolas"/>
+          <w:b w:val="0"/>
+          <w:i w:val="0"/>
+          <w:sz w:val="18"/>
+        </w:rPr>
+        <w:t>cosmic-text</w:t>
+      </w:r>
+      <w:r>
+        <w:rPr>
+          <w:b w:val="0"/>
+          <w:i w:val="0"/>
+        </w:rPr>
+        <w:t>, con las tipografías incluidas en el producto. Permite abrir proyectos, editar archivos y consultar el chat; muestra el estado del worker en el panel «Segundo plano» y las fuentes recibidas como enlaces al archivo y a la línea. La paleta «Agentes» integra la selección de proveedores y del modelo del worker, y el manual de uso se abre desde la propia aplicación.</w:t>
       </w:r>
     </w:p>
     <w:p>
@@ -2819,7 +2843,7 @@
               <a:graphicData uri="http://schemas.openxmlformats.org/drawingml/2006/picture">
                 <pic:pic>
                   <pic:nvPicPr>
-                    <pic:cNvPr id="0" name="fig-chat-fuentes.png"/>
+                    <pic:cNvPr id="0" name="fig-bienvenida.png"/>
                     <pic:cNvPicPr/>
                   </pic:nvPicPr>
                   <pic:blipFill>
@@ -2857,6 +2881,72 @@
         <w:fldChar w:fldCharType="end"/>
       </w:r>
       <w:r>
+        <w:t>. Pantalla de bienvenida del editor</w:t>
+      </w:r>
+    </w:p>
+    <w:p>
+      <w:r>
+        <w:rPr>
+          <w:b w:val="0"/>
+          <w:i w:val="0"/>
+        </w:rPr>
+        <w:t>Las herramientas ofrecidas al asistente son lectura de archivos, listado y búsqueda textual. Se ejecutan mediante la guardia del proyecto y con límites de tamaño de salida. Su existencia no implica edición autónoma ni que cada respuesta consulte todos los archivos pertinentes. Persisten carreras posibles entre inspeccionar una ruta y abrirla; el modelo de uso evaluado es un escritorio local de un solo usuario.</w:t>
+      </w:r>
+    </w:p>
+    <w:p>
+      <w:pPr>
+        <w:jc w:val="center"/>
+      </w:pPr>
+      <w:r>
+        <w:drawing>
+          <wp:inline xmlns:a="http://schemas.openxmlformats.org/drawingml/2006/main" xmlns:pic="http://schemas.openxmlformats.org/drawingml/2006/picture">
+            <wp:extent cx="5580000" cy="3138750"/>
+            <wp:docPr id="5" name="Picture 5"/>
+            <wp:cNvGraphicFramePr>
+              <a:graphicFrameLocks noChangeAspect="1"/>
+            </wp:cNvGraphicFramePr>
+            <a:graphic>
+              <a:graphicData uri="http://schemas.openxmlformats.org/drawingml/2006/picture">
+                <pic:pic>
+                  <pic:nvPicPr>
+                    <pic:cNvPr id="0" name="fig-chat-fuentes.png"/>
+                    <pic:cNvPicPr/>
+                  </pic:nvPicPr>
+                  <pic:blipFill>
+                    <a:blip r:embed="rId15"/>
+                    <a:stretch>
+                      <a:fillRect/>
+                    </a:stretch>
+                  </pic:blipFill>
+                  <pic:spPr>
+                    <a:xfrm>
+                      <a:off x="0" y="0"/>
+                      <a:ext cx="5580000" cy="3138750"/>
+                    </a:xfrm>
+                    <a:prstGeom prst="rect"/>
+                  </pic:spPr>
+                </pic:pic>
+              </a:graphicData>
+            </a:graphic>
+          </wp:inline>
+        </w:drawing>
+      </w:r>
+    </w:p>
+    <w:p>
+      <w:pPr>
+        <w:pStyle w:val="Caption"/>
+        <w:jc w:val="center"/>
+      </w:pPr>
+      <w:r>
+        <w:t xml:space="preserve">Figura </w:t>
+      </w:r>
+      <w:r>
+        <w:fldChar w:fldCharType="begin"/>
+        <w:instrText xml:space="preserve">SEQ Figura \* ARABIC</w:instrText>
+        <w:fldChar w:fldCharType="separate"/>
+        <w:fldChar w:fldCharType="end"/>
+      </w:r>
+      <w:r>
         <w:t>. Ronda de chat con Claude sobre un proyecto sintético: el asistente lee el archivo mediante la herramienta del editor y la respuesta enlaza las fuentes con ruta y líneas</w:t>
       </w:r>
     </w:p>
@@ -2953,7 +3043,7 @@
         <w:drawing>
           <wp:inline xmlns:a="http://schemas.openxmlformats.org/drawingml/2006/main" xmlns:pic="http://schemas.openxmlformats.org/drawingml/2006/picture">
             <wp:extent cx="5580000" cy="2188235"/>
-            <wp:docPr id="5" name="Picture 5"/>
+            <wp:docPr id="6" name="Picture 6"/>
             <wp:cNvGraphicFramePr>
               <a:graphicFrameLocks noChangeAspect="1"/>
             </wp:cNvGraphicFramePr>
@@ -2965,7 +3055,7 @@
                     <pic:cNvPicPr/>
                   </pic:nvPicPr>
                   <pic:blipFill>
-                    <a:blip r:embed="rId15"/>
+                    <a:blip r:embed="rId16"/>
                     <a:stretch>
                       <a:fillRect/>
                     </a:stretch>
@@ -3038,7 +3128,7 @@
           <w:b w:val="0"/>
           <w:i w:val="0"/>
         </w:rPr>
-        <w:t xml:space="preserve">La configuración inicial emplea Qwen2.5-Coder-1.5B-Instruct Q4_K_M mediante llama.cpp y BGE-M3 en CPU. El catálogo de </w:t>
+        <w:t xml:space="preserve">La configuración inicial emplea Qwen2.5-Coder-1.5B-Instruct Q4_K_M [23] mediante llama.cpp [28] y BGE-M3 en CPU. El catálogo de </w:t>
       </w:r>
       <w:r>
         <w:rPr>
@@ -3054,7 +3144,7 @@
           <w:b w:val="0"/>
           <w:i w:val="0"/>
         </w:rPr>
-        <w:t xml:space="preserve"> permite descargar modelos con revisión y SHA-256 fijos, y la paleta permite seleccionar cualquier GGUF compatible. El razonamiento del vectorizador va desactivado: su tarea es describir, no conversar. El techo recomendado para una GPU dedicada es Qwen3 8B a 4 bits; por encima solo tiene sentido en equipos con memoria unificada. Las recomendaciones de memoria del catálogo son orientativas y no equivalen a benchmarks de todos sus modelos.</w:t>
+        <w:t xml:space="preserve"> permite descargar modelos con revisión y SHA-256 fijos, y la paleta permite seleccionar cualquier GGUF compatible. El razonamiento del vectorizador va desactivado: su tarea es describir, no conversar. El techo recomendado para una GPU dedicada es Qwen3 8B [30] a 4 bits; por encima solo tiene sentido en equipos con memoria unificada. Las recomendaciones de memoria del catálogo son orientativas y no equivalen a benchmarks de todos sus modelos.</w:t>
       </w:r>
     </w:p>
     <w:p>
@@ -3428,13 +3518,14 @@
         <w:tblLook w:firstColumn="1" w:firstRow="1" w:lastColumn="0" w:lastRow="0" w:noHBand="0" w:noVBand="1" w:val="04A0"/>
       </w:tblPr>
       <w:tblGrid>
-        <w:gridCol w:w="4536"/>
-        <w:gridCol w:w="4536"/>
+        <w:gridCol w:w="3024"/>
+        <w:gridCol w:w="3024"/>
+        <w:gridCol w:w="3024"/>
       </w:tblGrid>
       <w:tr>
         <w:tc>
           <w:tcPr>
-            <w:tcW w:type="dxa" w:w="4536"/>
+            <w:tcW w:type="dxa" w:w="3024"/>
           </w:tcPr>
           <w:p>
             <w:r>
@@ -3443,13 +3534,13 @@
                 <w:i w:val="0"/>
                 <w:sz w:val="18"/>
               </w:rPr>
-              <w:t>Concepto</w:t>
+              <w:t>Tipo de coste</w:t>
             </w:r>
           </w:p>
         </w:tc>
         <w:tc>
           <w:tcPr>
-            <w:tcW w:type="dxa" w:w="4536"/>
+            <w:tcW w:type="dxa" w:w="3024"/>
           </w:tcPr>
           <w:p>
             <w:r>
@@ -3458,7 +3549,22 @@
                 <w:i w:val="0"/>
                 <w:sz w:val="18"/>
               </w:rPr>
-              <w:t>Importe o base</w:t>
+              <w:t>Valor</w:t>
+            </w:r>
+          </w:p>
+        </w:tc>
+        <w:tc>
+          <w:tcPr>
+            <w:tcW w:type="dxa" w:w="3024"/>
+          </w:tcPr>
+          <w:p>
+            <w:r>
+              <w:rPr>
+                <w:b/>
+                <w:i w:val="0"/>
+                <w:sz w:val="18"/>
+              </w:rPr>
+              <w:t>Comentarios</w:t>
             </w:r>
           </w:p>
         </w:tc>
@@ -3466,7 +3572,7 @@
       <w:tr>
         <w:tc>
           <w:tcPr>
-            <w:tcW w:type="dxa" w:w="4536"/>
+            <w:tcW w:type="dxa" w:w="3024"/>
           </w:tcPr>
           <w:p>
             <w:r>
@@ -3475,13 +3581,13 @@
                 <w:i w:val="0"/>
                 <w:sz w:val="18"/>
               </w:rPr>
-              <w:t>Dedicación del autor</w:t>
+              <w:t>Horas de trabajo en el proyecto</w:t>
             </w:r>
           </w:p>
         </w:tc>
         <w:tc>
           <w:tcPr>
-            <w:tcW w:type="dxa" w:w="4536"/>
+            <w:tcW w:type="dxa" w:w="3024"/>
           </w:tcPr>
           <w:p>
             <w:r>
@@ -3490,15 +3596,13 @@
                 <w:i w:val="0"/>
                 <w:sz w:val="18"/>
               </w:rPr>
-              <w:t>[COMPLETAR — horas y criterio de valoración]</w:t>
+              <w:t>[COMPLETAR — horas totales]</w:t>
             </w:r>
           </w:p>
         </w:tc>
-      </w:tr>
-      <w:tr>
         <w:tc>
           <w:tcPr>
-            <w:tcW w:type="dxa" w:w="4536"/>
+            <w:tcW w:type="dxa" w:w="3024"/>
           </w:tcPr>
           <w:p>
             <w:r>
@@ -3507,13 +3611,15 @@
                 <w:i w:val="0"/>
                 <w:sz w:val="18"/>
               </w:rPr>
-              <w:t>Hardware</w:t>
+              <w:t>Trabajo del autor; no han participado otras personas</w:t>
             </w:r>
           </w:p>
         </w:tc>
+      </w:tr>
+      <w:tr>
         <w:tc>
           <w:tcPr>
-            <w:tcW w:type="dxa" w:w="4536"/>
+            <w:tcW w:type="dxa" w:w="3024"/>
           </w:tcPr>
           <w:p>
             <w:r>
@@ -3522,15 +3628,13 @@
                 <w:i w:val="0"/>
                 <w:sz w:val="18"/>
               </w:rPr>
-              <w:t>[COMPLETAR — coste imputado o amortización; distinguir equipos disponibles y usados]</w:t>
+              <w:t>Equipo técnico: portátil con RTX 3060 de 6 GB y 15 GiB de RAM</w:t>
             </w:r>
           </w:p>
         </w:tc>
-      </w:tr>
-      <w:tr>
         <w:tc>
           <w:tcPr>
-            <w:tcW w:type="dxa" w:w="4536"/>
+            <w:tcW w:type="dxa" w:w="3024"/>
           </w:tcPr>
           <w:p>
             <w:r>
@@ -3539,13 +3643,13 @@
                 <w:i w:val="0"/>
                 <w:sz w:val="18"/>
               </w:rPr>
-              <w:t>Suscripciones y servicios</w:t>
+              <w:t>[COMPLETAR — valor de mercado] €</w:t>
             </w:r>
           </w:p>
         </w:tc>
         <w:tc>
           <w:tcPr>
-            <w:tcW w:type="dxa" w:w="4536"/>
+            <w:tcW w:type="dxa" w:w="3024"/>
           </w:tcPr>
           <w:p>
             <w:r>
@@ -3554,7 +3658,7 @@
                 <w:i w:val="0"/>
                 <w:sz w:val="18"/>
               </w:rPr>
-              <w:t>[COMPLETAR — gastos reales por periodo]</w:t>
+              <w:t>Equipo propio, no adquirido para el proyecto; en él se hicieron todas las pruebas registradas</w:t>
             </w:r>
           </w:p>
         </w:tc>
@@ -3562,7 +3666,242 @@
       <w:tr>
         <w:tc>
           <w:tcPr>
-            <w:tcW w:type="dxa" w:w="4536"/>
+            <w:tcW w:type="dxa" w:w="3024"/>
+          </w:tcPr>
+          <w:p>
+            <w:r>
+              <w:rPr>
+                <w:b w:val="0"/>
+                <w:i w:val="0"/>
+                <w:sz w:val="18"/>
+              </w:rPr>
+              <w:t>Equipo técnico: dos estaciones con dos RTX 3090</w:t>
+            </w:r>
+          </w:p>
+        </w:tc>
+        <w:tc>
+          <w:tcPr>
+            <w:tcW w:type="dxa" w:w="3024"/>
+          </w:tcPr>
+          <w:p>
+            <w:r>
+              <w:rPr>
+                <w:b w:val="0"/>
+                <w:i w:val="0"/>
+                <w:sz w:val="18"/>
+              </w:rPr>
+              <w:t>[COMPLETAR — valor de mercado] €</w:t>
+            </w:r>
+          </w:p>
+        </w:tc>
+        <w:tc>
+          <w:tcPr>
+            <w:tcW w:type="dxa" w:w="3024"/>
+          </w:tcPr>
+          <w:p>
+            <w:r>
+              <w:rPr>
+                <w:b w:val="0"/>
+                <w:i w:val="0"/>
+                <w:sz w:val="18"/>
+              </w:rPr>
+              <w:t>Equipos propios accesibles por SSH; no se usaron para entrenar</w:t>
+            </w:r>
+          </w:p>
+        </w:tc>
+      </w:tr>
+      <w:tr>
+        <w:tc>
+          <w:tcPr>
+            <w:tcW w:type="dxa" w:w="3024"/>
+          </w:tcPr>
+          <w:p>
+            <w:r>
+              <w:rPr>
+                <w:b w:val="0"/>
+                <w:i w:val="0"/>
+                <w:sz w:val="18"/>
+              </w:rPr>
+              <w:t>Software utilizado</w:t>
+            </w:r>
+          </w:p>
+        </w:tc>
+        <w:tc>
+          <w:tcPr>
+            <w:tcW w:type="dxa" w:w="3024"/>
+          </w:tcPr>
+          <w:p>
+            <w:r>
+              <w:rPr>
+                <w:b w:val="0"/>
+                <w:i w:val="0"/>
+                <w:sz w:val="18"/>
+              </w:rPr>
+              <w:t>0 €</w:t>
+            </w:r>
+          </w:p>
+        </w:tc>
+        <w:tc>
+          <w:tcPr>
+            <w:tcW w:type="dxa" w:w="3024"/>
+          </w:tcPr>
+          <w:p>
+            <w:r>
+              <w:rPr>
+                <w:b w:val="0"/>
+                <w:i w:val="0"/>
+                <w:sz w:val="18"/>
+              </w:rPr>
+              <w:t>Rust, Sled, Qdrant, Neo4j, llama.cpp, ONNX Runtime, Python, Docker y los pesos de Qwen y BGE-M3 son de código abierto o de descarga gratuita bajo sus licencias</w:t>
+            </w:r>
+          </w:p>
+        </w:tc>
+      </w:tr>
+      <w:tr>
+        <w:tc>
+          <w:tcPr>
+            <w:tcW w:type="dxa" w:w="3024"/>
+          </w:tcPr>
+          <w:p>
+            <w:r>
+              <w:rPr>
+                <w:b w:val="0"/>
+                <w:i w:val="0"/>
+                <w:sz w:val="18"/>
+              </w:rPr>
+              <w:t>Suscripciones a asistentes (Claude y ChatGPT/Codex)</w:t>
+            </w:r>
+          </w:p>
+        </w:tc>
+        <w:tc>
+          <w:tcPr>
+            <w:tcW w:type="dxa" w:w="3024"/>
+          </w:tcPr>
+          <w:p>
+            <w:r>
+              <w:rPr>
+                <w:b w:val="0"/>
+                <w:i w:val="0"/>
+                <w:sz w:val="18"/>
+              </w:rPr>
+              <w:t>[COMPLETAR — gasto real por periodo] €</w:t>
+            </w:r>
+          </w:p>
+        </w:tc>
+        <w:tc>
+          <w:tcPr>
+            <w:tcW w:type="dxa" w:w="3024"/>
+          </w:tcPr>
+          <w:p>
+            <w:r>
+              <w:rPr>
+                <w:b w:val="0"/>
+                <w:i w:val="0"/>
+                <w:sz w:val="18"/>
+              </w:rPr>
+              <w:t>Necesarias para las rondas con proveedores reales; los servidores compatibles y Ollama no requieren suscripción</w:t>
+            </w:r>
+          </w:p>
+        </w:tc>
+      </w:tr>
+      <w:tr>
+        <w:tc>
+          <w:tcPr>
+            <w:tcW w:type="dxa" w:w="3024"/>
+          </w:tcPr>
+          <w:p>
+            <w:r>
+              <w:rPr>
+                <w:b w:val="0"/>
+                <w:i w:val="0"/>
+                <w:sz w:val="18"/>
+              </w:rPr>
+              <w:t>Estudios e informes</w:t>
+            </w:r>
+          </w:p>
+        </w:tc>
+        <w:tc>
+          <w:tcPr>
+            <w:tcW w:type="dxa" w:w="3024"/>
+          </w:tcPr>
+          <w:p>
+            <w:r>
+              <w:rPr>
+                <w:b w:val="0"/>
+                <w:i w:val="0"/>
+                <w:sz w:val="18"/>
+              </w:rPr>
+              <w:t>0 €</w:t>
+            </w:r>
+          </w:p>
+        </w:tc>
+        <w:tc>
+          <w:tcPr>
+            <w:tcW w:type="dxa" w:w="3024"/>
+          </w:tcPr>
+          <w:p>
+            <w:r>
+              <w:rPr>
+                <w:b w:val="0"/>
+                <w:i w:val="0"/>
+                <w:sz w:val="18"/>
+              </w:rPr>
+              <w:t>Todas las fuentes consultadas son de acceso abierto (arXiv y documentación pública)</w:t>
+            </w:r>
+          </w:p>
+        </w:tc>
+      </w:tr>
+      <w:tr>
+        <w:tc>
+          <w:tcPr>
+            <w:tcW w:type="dxa" w:w="3024"/>
+          </w:tcPr>
+          <w:p>
+            <w:r>
+              <w:rPr>
+                <w:b w:val="0"/>
+                <w:i w:val="0"/>
+                <w:sz w:val="18"/>
+              </w:rPr>
+              <w:t>Materiales empleados</w:t>
+            </w:r>
+          </w:p>
+        </w:tc>
+        <w:tc>
+          <w:tcPr>
+            <w:tcW w:type="dxa" w:w="3024"/>
+          </w:tcPr>
+          <w:p>
+            <w:r>
+              <w:rPr>
+                <w:b w:val="0"/>
+                <w:i w:val="0"/>
+                <w:sz w:val="18"/>
+              </w:rPr>
+              <w:t>0 €</w:t>
+            </w:r>
+          </w:p>
+        </w:tc>
+        <w:tc>
+          <w:tcPr>
+            <w:tcW w:type="dxa" w:w="3024"/>
+          </w:tcPr>
+          <w:p>
+            <w:r>
+              <w:rPr>
+                <w:b w:val="0"/>
+                <w:i w:val="0"/>
+                <w:sz w:val="18"/>
+              </w:rPr>
+              <w:t>Sin material de laboratorio; descargas de unos 1,15 GB para el runtime y el modelo del worker, además de BGE-M3 y las imágenes de los almacenes</w:t>
+            </w:r>
+          </w:p>
+        </w:tc>
+      </w:tr>
+      <w:tr>
+        <w:tc>
+          <w:tcPr>
+            <w:tcW w:type="dxa" w:w="3024"/>
           </w:tcPr>
           <w:p>
             <w:r>
@@ -3577,7 +3916,7 @@
         </w:tc>
         <w:tc>
           <w:tcPr>
-            <w:tcW w:type="dxa" w:w="4536"/>
+            <w:tcW w:type="dxa" w:w="3024"/>
           </w:tcPr>
           <w:p>
             <w:r>
@@ -3586,15 +3925,13 @@
                 <w:i w:val="0"/>
                 <w:sz w:val="18"/>
               </w:rPr>
-              <w:t>[COMPLETAR — estimación y método, si se incluyen]</w:t>
+              <w:t>[COMPLETAR — estimación, si se incluye]</w:t>
             </w:r>
           </w:p>
         </w:tc>
-      </w:tr>
-      <w:tr>
         <w:tc>
           <w:tcPr>
-            <w:tcW w:type="dxa" w:w="4536"/>
+            <w:tcW w:type="dxa" w:w="3024"/>
           </w:tcPr>
           <w:p>
             <w:r>
@@ -3603,54 +3940,7 @@
                 <w:i w:val="0"/>
                 <w:sz w:val="18"/>
               </w:rPr>
-              <w:t>Software y modelos</w:t>
-            </w:r>
-          </w:p>
-        </w:tc>
-        <w:tc>
-          <w:tcPr>
-            <w:tcW w:type="dxa" w:w="4536"/>
-          </w:tcPr>
-          <w:p>
-            <w:r>
-              <w:rPr>
-                <w:b w:val="0"/>
-                <w:i w:val="0"/>
-                <w:sz w:val="18"/>
-              </w:rPr>
-              <w:t>0 €: componentes de código abierto y pesos descargables bajo sus licencias</w:t>
-            </w:r>
-          </w:p>
-        </w:tc>
-      </w:tr>
-      <w:tr>
-        <w:tc>
-          <w:tcPr>
-            <w:tcW w:type="dxa" w:w="4536"/>
-          </w:tcPr>
-          <w:p>
-            <w:r>
-              <w:rPr>
-                <w:b w:val="0"/>
-                <w:i w:val="0"/>
-                <w:sz w:val="18"/>
-              </w:rPr>
-              <w:t>Entrenamiento propio</w:t>
-            </w:r>
-          </w:p>
-        </w:tc>
-        <w:tc>
-          <w:tcPr>
-            <w:tcW w:type="dxa" w:w="4536"/>
-          </w:tcPr>
-          <w:p>
-            <w:r>
-              <w:rPr>
-                <w:b w:val="0"/>
-                <w:i w:val="0"/>
-                <w:sz w:val="18"/>
-              </w:rPr>
-              <w:t>No realizado; no se declara un gasto ni un ahorro medido</w:t>
+              <w:t>Coste de la inferencia local; no se ha medido el consumo</w:t>
             </w:r>
           </w:p>
         </w:tc>
@@ -3680,7 +3970,7 @@
           <w:b w:val="0"/>
           <w:i w:val="0"/>
         </w:rPr>
-        <w:t>La disponibilidad de software y pesos descargables no elimina las condiciones de licencia ni los costes operativos. La revisión de licencias de distribución acompaña al paquete.</w:t>
+        <w:t>No se presenta un coste total hasta completar las filas pendientes. La disponibilidad de software y pesos descargables no elimina las condiciones de licencia ni los costes operativos. La revisión de licencias de distribución acompaña al paquete.</w:t>
       </w:r>
     </w:p>
     <w:p>
@@ -3790,7 +4080,7 @@
           <w:b w:val="0"/>
           <w:i w:val="0"/>
         </w:rPr>
-        <w:t>); se añadieron al control previo del instalador. No se certifica el ciclo completo con Docker y systemd en una máquina virtual limpia.</w:t>
+        <w:t>); se añadieron al control previo del instalador. No se certifica el ciclo completo con Docker y systemd en una máquina virtual limpia. El paquete comprobado se compiló a partir de la revisión del 10 de septiembre; el script de empaquetado permite regenerarlo desde la revisión entregada.</w:t>
       </w:r>
     </w:p>
     <w:p>
@@ -5630,7 +5920,7 @@
           <w:b w:val="0"/>
           <w:i w:val="0"/>
         </w:rPr>
-        <w:t>[6] "Every Attention Matters: An Efficient Hybrid Architecture for Long-Context Reasoning", arXiv:2510.19338, 2025. https://arxiv.org/abs/2510.19338</w:t>
+        <w:t>[6] Ling Team, "Every Attention Matters: An Efficient Hybrid Architecture for Long-Context Reasoning", arXiv:2510.19338, 2025. https://arxiv.org/abs/2510.19338</w:t>
       </w:r>
     </w:p>
     <w:p>
@@ -5639,7 +5929,7 @@
           <w:b w:val="0"/>
           <w:i w:val="0"/>
         </w:rPr>
-        <w:t>[7] "Scaling Linear Attention with Sparse State Expansion", arXiv:2507.16577, 2025. https://arxiv.org/abs/2507.16577</w:t>
+        <w:t>[7] Y. Pan, Y. An, Z. Li, Y. Chou, R. Zhu, X. Wang, M. Wang, J. Wang y G. Li, "Scaling Linear Attention with Sparse State Expansion", arXiv:2507.16577, 2025. https://arxiv.org/abs/2507.16577</w:t>
       </w:r>
     </w:p>
     <w:p>
@@ -5657,7 +5947,7 @@
           <w:b w:val="0"/>
           <w:i w:val="0"/>
         </w:rPr>
-        <w:t>[9] "Auxiliary-Loss-Free Load Balancing Strategy for Mixture-of-Experts", arXiv:2408.15664, 2024.</w:t>
+        <w:t>[9] L. Wang, H. Gao, C. Zhao, X. Sun y D. Dai, "Auxiliary-Loss-Free Load Balancing Strategy for Mixture-of-Experts", arXiv:2408.15664, 2024.</w:t>
       </w:r>
     </w:p>
     <w:p>
@@ -5702,7 +5992,7 @@
           <w:b w:val="0"/>
           <w:i w:val="0"/>
         </w:rPr>
-        <w:t>[12c] "Rethinking Kullback-Leibler Divergence in Knowledge Distillation for Large Language Models", arXiv:2404.02657, 2024. https://arxiv.org/abs/2404.02657</w:t>
+        <w:t>[12c] T. Wu, C. Tao, J. Wang, R. Yang, Z. Zhao y N. Wong, "Rethinking Kullback-Leibler Divergence in Knowledge Distillation for Large Language Models", arXiv:2404.02657, 2024. https://arxiv.org/abs/2404.02657</w:t>
       </w:r>
     </w:p>
     <w:p>
@@ -5729,7 +6019,7 @@
           <w:b w:val="0"/>
           <w:i w:val="0"/>
         </w:rPr>
-        <w:t>[15] "Efficient Code Embeddings from Code Generation Models", arXiv:2508.21290, 2025. https://arxiv.org/abs/2508.21290</w:t>
+        <w:t>[15] D. Kryvosheieva, S. Sturua, M. Günther y H. Xiao, "Efficient Code Embeddings from Code Generation Models", arXiv:2508.21290, 2025. https://arxiv.org/abs/2508.21290</w:t>
       </w:r>
     </w:p>
     <w:p>
@@ -5747,7 +6037,7 @@
           <w:b w:val="0"/>
           <w:i w:val="0"/>
         </w:rPr>
-        <w:t>[17] Qdrant — Vector Database. https://qdrant.tech</w:t>
+        <w:t>[17] Qdrant, "Qdrant — Vector Database", documentación. https://qdrant.tech (consultado en septiembre de 2026).</w:t>
       </w:r>
     </w:p>
     <w:p>
@@ -5756,7 +6046,7 @@
           <w:b w:val="0"/>
           <w:i w:val="0"/>
         </w:rPr>
-        <w:t>[18] Neo4j Graph Database. https://neo4j.com</w:t>
+        <w:t>[18] Neo4j, "Neo4j Graph Database", documentación. https://neo4j.com (consultado en septiembre de 2026).</w:t>
       </w:r>
     </w:p>
     <w:p>
@@ -5797,7 +6087,7 @@
           <w:b w:val="0"/>
           <w:i w:val="0"/>
         </w:rPr>
-        <w:t>. https://huggingface.co/BAAI</w:t>
+        <w:t>. https://huggingface.co/BAAI (consultado en septiembre de 2026).</w:t>
       </w:r>
     </w:p>
     <w:p>
@@ -5824,7 +6114,7 @@
           <w:b w:val="0"/>
           <w:i w:val="0"/>
         </w:rPr>
-        <w:t>[22] ONNX Runtime. https://onnxruntime.ai</w:t>
+        <w:t>[22] Microsoft, "ONNX Runtime", documentación. https://onnxruntime.ai (consultado en septiembre de 2026).</w:t>
       </w:r>
     </w:p>
     <w:p>
@@ -5878,7 +6168,7 @@
           <w:b w:val="0"/>
           <w:i w:val="0"/>
         </w:rPr>
-        <w:t>[28] ggml-org, "llama.cpp server", documentación y código. https://github.com/ggml-org/llama.cpp/tree/master/tools/server</w:t>
+        <w:t>[28] ggml-org, "llama.cpp server", documentación y código. https://github.com/ggml-org/llama.cpp/tree/master/tools/server (consultado en septiembre de 2026).</w:t>
       </w:r>
     </w:p>
     <w:p>
@@ -5888,6 +6178,33 @@
           <w:i w:val="0"/>
         </w:rPr>
         <w:t>[29] J. Chen et al., "M3-Embedding: Multi-Linguality, Multi-Functionality, Multi-Granularity Text Embeddings Through Self-Knowledge Distillation", arXiv:2402.03216, 2024. https://arxiv.org/abs/2402.03216</w:t>
+      </w:r>
+    </w:p>
+    <w:p>
+      <w:r>
+        <w:rPr>
+          <w:b w:val="0"/>
+          <w:i w:val="0"/>
+        </w:rPr>
+        <w:t>[30] Qwen Team, "Qwen3 Technical Report", arXiv:2505.09388, 2025. https://arxiv.org/abs/2505.09388</w:t>
+      </w:r>
+    </w:p>
+    <w:p>
+      <w:r>
+        <w:rPr>
+          <w:b w:val="0"/>
+          <w:i w:val="0"/>
+        </w:rPr>
+        <w:t>[31] M. Brunsfeld et al., "Tree-sitter: an incremental parsing system for programming tools", documentación y código. https://tree-sitter.github.io (consultado en septiembre de 2026).</w:t>
+      </w:r>
+    </w:p>
+    <w:p>
+      <w:r>
+        <w:rPr>
+          <w:b w:val="0"/>
+          <w:i w:val="0"/>
+        </w:rPr>
+        <w:t>[32] T. Kemp et al., "sled: an embedded database", código. https://github.com/spacejam/sled (consultado en septiembre de 2026).</w:t>
       </w:r>
     </w:p>
     <w:p>
@@ -6644,7 +6961,20 @@
           <w:b w:val="0"/>
           <w:i w:val="0"/>
         </w:rPr>
-        <w:t>** Verificado** — confirmado 3-0 en la verificación adversarial de este barrido.</w:t>
+      </w:r>
+      <w:r>
+        <w:rPr>
+          <w:b/>
+          <w:i w:val="0"/>
+        </w:rPr>
+        <w:t>Verificado</w:t>
+      </w:r>
+      <w:r>
+        <w:rPr>
+          <w:b w:val="0"/>
+          <w:i w:val="0"/>
+        </w:rPr>
+        <w:t xml:space="preserve"> — confirmado 3-0 en la verificación adversarial de este barrido.</w:t>
       </w:r>
     </w:p>
     <w:p>
@@ -6659,7 +6989,20 @@
           <w:b w:val="0"/>
           <w:i w:val="0"/>
         </w:rPr>
-        <w:t xml:space="preserve">** Fundamental** — matemática canónica establecida (referencia original); </w:t>
+      </w:r>
+      <w:r>
+        <w:rPr>
+          <w:b/>
+          <w:i w:val="0"/>
+        </w:rPr>
+        <w:t>Fundamental</w:t>
+      </w:r>
+      <w:r>
+        <w:rPr>
+          <w:b w:val="0"/>
+          <w:i w:val="0"/>
+        </w:rPr>
+        <w:t xml:space="preserve"> — matemática canónica establecida (referencia original); </w:t>
       </w:r>
       <w:r>
         <w:rPr>
@@ -6702,7 +7045,20 @@
           <w:b w:val="0"/>
           <w:i w:val="0"/>
         </w:rPr>
-        <w:t xml:space="preserve">** Principio de diseño** — la idea es reutilizable, pero </w:t>
+      </w:r>
+      <w:r>
+        <w:rPr>
+          <w:b/>
+          <w:i w:val="0"/>
+        </w:rPr>
+        <w:t>Principio de diseño</w:t>
+      </w:r>
+      <w:r>
+        <w:rPr>
+          <w:b w:val="0"/>
+          <w:i w:val="0"/>
+        </w:rPr>
+        <w:t xml:space="preserve"> — la idea es reutilizable, pero </w:t>
       </w:r>
       <w:r>
         <w:rPr>
@@ -6745,7 +7101,20 @@
           <w:b w:val="0"/>
           <w:i w:val="0"/>
         </w:rPr>
-        <w:t>** Cuestión abierta** — debate activo en la literatura; se declara como tal.</w:t>
+      </w:r>
+      <w:r>
+        <w:rPr>
+          <w:b/>
+          <w:i w:val="0"/>
+        </w:rPr>
+        <w:t>Cuestión abierta</w:t>
+      </w:r>
+      <w:r>
+        <w:rPr>
+          <w:b w:val="0"/>
+          <w:i w:val="0"/>
+        </w:rPr>
+        <w:t xml:space="preserve"> — debate activo en la literatura; se declara como tal.</w:t>
       </w:r>
     </w:p>
     <w:p>
@@ -7079,7 +7448,7 @@
           <w:b w:val="0"/>
           <w:i w:val="0"/>
         </w:rPr>
-        <w:t>1.1 Multi-head Latent Attention (MLA) — comprimir el KV ·  Verificado</w:t>
+        <w:t>1.1 Multi-head Latent Attention (MLA) — comprimir el KV · Verificado</w:t>
       </w:r>
     </w:p>
     <w:p>
@@ -7124,7 +7493,7 @@
           <w:rFonts w:ascii="Consolas" w:hAnsi="Consolas"/>
           <w:sz w:val="18"/>
         </w:rPr>
-        <w:t>c_t^{KV} = W^{DKV} · h_t            con  d_c ≪ d_h · n_h      (down-projection)</w:t>
+        <w:t>c_t^{KV} = W^{DKV} · h_t            con  d_c &lt;&lt; d_h · n_h      (down-projection)</w:t>
         <w:br/>
         <w:t>k_t^{C}  = W^{UK} · c_t^{KV}        v_t^{C} = W^{UV} · c_t^{KV}  (up-projections)</w:t>
         <w:br/>
@@ -7463,7 +7832,7 @@
           <w:b w:val="0"/>
           <w:i w:val="0"/>
         </w:rPr>
-        <w:t>1.2 Native Sparse Attention (NSA) — atención dispersa entrenable ·  Verificado</w:t>
+        <w:t>1.2 Native Sparse Attention (NSA) — atención dispersa entrenable · Verificado</w:t>
       </w:r>
     </w:p>
     <w:p>
@@ -7876,7 +8245,7 @@
           <w:b w:val="0"/>
           <w:i w:val="0"/>
         </w:rPr>
-        <w:t>1.3 Atención lineal / lightning + SSE — estado de tamaño fijo ·  Verificado</w:t>
+        <w:t>1.3 Atención lineal / lightning + SSE — estado de tamaño fijo · Verificado</w:t>
       </w:r>
     </w:p>
     <w:p>
@@ -8492,7 +8861,7 @@
           <w:b w:val="0"/>
           <w:i/>
         </w:rPr>
-        <w:t xml:space="preserve">( el kernel </w:t>
+        <w:t xml:space="preserve">(el kernel </w:t>
       </w:r>
       <w:r>
         <w:rPr>
@@ -8544,7 +8913,7 @@
           <w:b w:val="0"/>
           <w:i w:val="0"/>
         </w:rPr>
-        <w:t>2.1 DeepSeekMoE: experto compartido + expertos de grano fino ·  Verificado</w:t>
+        <w:t>2.1 DeepSeekMoE: experto compartido + expertos de grano fino · Verificado</w:t>
       </w:r>
     </w:p>
     <w:p>
@@ -8846,7 +9215,7 @@
           <w:b w:val="0"/>
           <w:i w:val="0"/>
         </w:rPr>
-        <w:t xml:space="preserve">  </w:t>
+        <w:t xml:space="preserve"> </w:t>
       </w:r>
       <w:r>
         <w:rPr>
@@ -8983,7 +9352,7 @@
           <w:b w:val="0"/>
           <w:i w:val="0"/>
         </w:rPr>
-        <w:t>2.2 Balanceo de carga SIN pérdida auxiliar ·  Verificado</w:t>
+        <w:t>2.2 Balanceo de carga SIN pérdida auxiliar · Verificado</w:t>
       </w:r>
     </w:p>
     <w:p>
@@ -9065,7 +9434,7 @@
           <w:rFonts w:ascii="Consolas" w:hAnsi="Consolas"/>
           <w:sz w:val="18"/>
         </w:rPr>
-        <w:t>enruta i  ⟺  (s_{i,t} + b_i) ∈ TopK          (el peso sigue siendo s_{i,t}, sin sesgo)</w:t>
+        <w:t>enruta i  &lt;=&gt;  (s_{i,t} + b_i) ∈ TopK          (el peso sigue siendo s_{i,t}, sin sesgo)</w:t>
         <w:br/>
         <w:t>b_i ← b_i − γ  si el experto i está sobrecargado</w:t>
         <w:br/>
@@ -9437,7 +9806,7 @@
           <w:b w:val="0"/>
           <w:i w:val="0"/>
         </w:rPr>
-        <w:t xml:space="preserve"> con temperatura ·  Fundamental</w:t>
+        <w:t xml:space="preserve"> con temperatura · Fundamental</w:t>
       </w:r>
     </w:p>
     <w:p>
@@ -9679,7 +10048,7 @@
           <w:b w:val="0"/>
           <w:i/>
         </w:rPr>
-        <w:t>( no re-verificado en este barrido;</w:t>
+        <w:t>(no re-verificado en este barrido;</w:t>
       </w:r>
       <w:r>
         <w:rPr>
@@ -9715,7 +10084,7 @@
           <w:b w:val="0"/>
           <w:i w:val="0"/>
         </w:rPr>
-        <w:t xml:space="preserve"> ❌ </w:t>
+        <w:t xml:space="preserve"> </w:t>
       </w:r>
       <w:r>
         <w:rPr>
@@ -9798,7 +10167,7 @@
           <w:b w:val="0"/>
           <w:i w:val="0"/>
         </w:rPr>
-        <w:t>3.2 Sequence-Level KD — la vía viable sin logits ·  Verificado</w:t>
+        <w:t>3.2 Sequence-Level KD — la vía viable sin logits · Verificado</w:t>
       </w:r>
     </w:p>
     <w:p>
@@ -10130,7 +10499,7 @@
           <w:b w:val="0"/>
           <w:i w:val="0"/>
         </w:rPr>
-        <w:t xml:space="preserve">  </w:t>
+        <w:t xml:space="preserve"> </w:t>
       </w:r>
       <w:r>
         <w:rPr>
@@ -10198,7 +10567,7 @@
           <w:b w:val="0"/>
           <w:i w:val="0"/>
         </w:rPr>
-        <w:t>3.3 Reverse-KL (MiniLLM) y GKD — por qué NO nos sirven ·  Verificado</w:t>
+        <w:t>3.3 Reverse-KL (MiniLLM) y GKD — por qué NO nos sirven · Verificado</w:t>
       </w:r>
     </w:p>
     <w:p>
@@ -10371,7 +10740,7 @@
           <w:b w:val="0"/>
           <w:i w:val="0"/>
         </w:rPr>
-        <w:t xml:space="preserve"> → ❌ no viable solo con texto.</w:t>
+        <w:t xml:space="preserve"> → no viable solo con texto.</w:t>
       </w:r>
       <w:r>
         <w:rPr>
@@ -10519,7 +10888,7 @@
           <w:b w:val="0"/>
           <w:i w:val="0"/>
         </w:rPr>
-        <w:t xml:space="preserve">❌ no viable sin logits. El </w:t>
+        <w:t xml:space="preserve">no viable sin logits. El </w:t>
       </w:r>
       <w:r>
         <w:rPr>
@@ -10619,7 +10988,7 @@
           <w:b w:val="0"/>
           <w:i w:val="0"/>
         </w:rPr>
-        <w:t>3.4 Matiz: ¿reverse-KL es realmente mejor? ·  Cuestión abierta</w:t>
+        <w:t>3.4 Matiz: ¿reverse-KL es realmente mejor? · Cuestión abierta</w:t>
       </w:r>
     </w:p>
     <w:p>
@@ -10908,7 +11277,7 @@
           <w:b w:val="0"/>
           <w:i w:val="0"/>
         </w:rPr>
-        <w:t>4.1 AWQ — cuantizar protegiendo canales por activación ·  Verificado</w:t>
+        <w:t>4.1 AWQ — cuantizar protegiendo canales por activación · Verificado</w:t>
       </w:r>
     </w:p>
     <w:p>
@@ -11176,7 +11545,7 @@
           <w:b w:val="0"/>
           <w:i w:val="0"/>
         </w:rPr>
-        <w:t xml:space="preserve">  </w:t>
+        <w:t xml:space="preserve"> </w:t>
       </w:r>
       <w:r>
         <w:rPr>
@@ -11230,7 +11599,7 @@
           <w:b w:val="0"/>
           <w:i w:val="0"/>
         </w:rPr>
-        <w:t>4.2 GPTQ — cuantización PTQ de segundo orden ·  Verificado</w:t>
+        <w:t>4.2 GPTQ — cuantización PTQ de segundo orden · Verificado</w:t>
       </w:r>
     </w:p>
     <w:p>
@@ -11424,7 +11793,7 @@
           <w:b w:val="0"/>
           <w:i w:val="0"/>
         </w:rPr>
-        <w:t xml:space="preserve">  Alternativa/complemento de AWQ para PTQ del backbone.</w:t>
+        <w:t xml:space="preserve"> Alternativa/complemento de AWQ para PTQ del backbone.</w:t>
       </w:r>
     </w:p>
     <w:p>
@@ -11436,7 +11805,7 @@
           <w:b w:val="0"/>
           <w:i w:val="0"/>
         </w:rPr>
-        <w:t>4.3 InfoNCE — la pérdida que da buenos embeddings ·  Fundamental</w:t>
+        <w:t>4.3 InfoNCE — la pérdida que da buenos embeddings · Fundamental</w:t>
       </w:r>
     </w:p>
     <w:p>
@@ -11639,7 +12008,7 @@
           <w:b w:val="0"/>
           <w:i/>
         </w:rPr>
-        <w:t>( canónico, no re-verificado.)</w:t>
+        <w:t>(canónico, no re-verificado.)</w:t>
       </w:r>
     </w:p>
     <w:p>
@@ -11661,7 +12030,7 @@
           <w:b w:val="0"/>
           <w:i w:val="0"/>
         </w:rPr>
-        <w:t xml:space="preserve">  Base para entrenar los </w:t>
+        <w:t xml:space="preserve"> Base para entrenar los </w:t>
       </w:r>
       <w:r>
         <w:rPr>
@@ -11715,7 +12084,7 @@
           <w:b w:val="0"/>
           <w:i w:val="0"/>
         </w:rPr>
-        <w:t>4.4 Last-token pooling — de decoder causal a embedding ·  Fundamental</w:t>
+        <w:t>4.4 Last-token pooling — de decoder causal a embedding · Fundamental</w:t>
       </w:r>
     </w:p>
     <w:p>
@@ -11884,7 +12253,7 @@
           <w:b w:val="0"/>
           <w:i/>
         </w:rPr>
-        <w:t>( no re-verificado.)</w:t>
+        <w:t>(no re-verificado.)</w:t>
       </w:r>
     </w:p>
     <w:p>
@@ -11975,7 +12344,7 @@
           <w:b w:val="0"/>
           <w:i w:val="0"/>
         </w:rPr>
-        <w:t>4.5 Matryoshka (MRL) — un vector, muchas dimensiones ·  Fundamental</w:t>
+        <w:t>4.5 Matryoshka (MRL) — un vector, muchas dimensiones · Fundamental</w:t>
       </w:r>
     </w:p>
     <w:p>
@@ -12200,7 +12569,7 @@
           <w:b w:val="0"/>
           <w:i/>
         </w:rPr>
-        <w:t>( no re-verificado.)</w:t>
+        <w:t>(no re-verificado.)</w:t>
       </w:r>
     </w:p>
     <w:p>
@@ -12222,7 +12591,7 @@
           <w:b w:val="0"/>
           <w:i w:val="0"/>
         </w:rPr>
-        <w:t xml:space="preserve">  Vectores </w:t>
+        <w:t xml:space="preserve"> Vectores </w:t>
       </w:r>
       <w:r>
         <w:rPr>
@@ -13099,7 +13468,7 @@
                 <w:i w:val="0"/>
                 <w:sz w:val="18"/>
               </w:rPr>
-              <w:t>❌ Necesitan logits del profesor</w:t>
+              <w:t>Necesitan logits del profesor</w:t>
             </w:r>
           </w:p>
         </w:tc>
@@ -13131,7 +13500,7 @@
                 <w:i w:val="0"/>
                 <w:sz w:val="18"/>
               </w:rPr>
-              <w:t>❌ Necesita logits del profesor</w:t>
+              <w:t>Necesita logits del profesor</w:t>
             </w:r>
           </w:p>
         </w:tc>
@@ -13164,7 +13533,7 @@
           <w:b w:val="0"/>
           <w:i w:val="0"/>
         </w:rPr>
-        <w:t>Cuestiones abiertas y lagunas honestas</w:t>
+        <w:t>Cuestiones abiertas</w:t>
       </w:r>
     </w:p>
     <w:p>
@@ -13469,7 +13838,7 @@
           <w:b w:val="0"/>
           <w:i w:val="0"/>
         </w:rPr>
-        <w:t>Referencias (todas verificadas como fuentes reales)</w:t>
+        <w:t>Referencias del anexo</w:t>
       </w:r>
     </w:p>
     <w:p>

</xml_diff>

<commit_message>
Memoria: repositorio de entrega, horas, suscripciones y estudio previo; tablas partibles con rótulo
Co-Authored-By: Claude Fable 5.1 <noreply@anthropic.com>
</commit_message>
<xml_diff>
--- a/memoria/Memoria TFM - Quirón.docx
+++ b/memoria/Memoria TFM - Quirón.docx
@@ -2201,7 +2201,7 @@
                 <w:i w:val="0"/>
                 <w:sz w:val="18"/>
               </w:rPr>
-              <w:t>Periodo (2026)</w:t>
+              <w:t>Periodo</w:t>
             </w:r>
           </w:p>
         </w:tc>
@@ -2248,6 +2248,68 @@
                 <w:i w:val="0"/>
                 <w:sz w:val="18"/>
               </w:rPr>
+              <w:t>Previo</w:t>
+            </w:r>
+          </w:p>
+        </w:tc>
+        <w:tc>
+          <w:tcPr>
+            <w:tcW w:type="dxa" w:w="2268"/>
+          </w:tcPr>
+          <w:p>
+            <w:r>
+              <w:rPr>
+                <w:b w:val="0"/>
+                <w:i w:val="0"/>
+                <w:sz w:val="18"/>
+              </w:rPr>
+              <w:t>Diciembre de 2025 – enero de 2026</w:t>
+            </w:r>
+          </w:p>
+        </w:tc>
+        <w:tc>
+          <w:tcPr>
+            <w:tcW w:type="dxa" w:w="2268"/>
+          </w:tcPr>
+          <w:p>
+            <w:r>
+              <w:rPr>
+                <w:b w:val="0"/>
+                <w:i w:val="0"/>
+                <w:sz w:val="18"/>
+              </w:rPr>
+              <w:t>Estudio propio, anterior al proyecto: grafos y Neo4j, y construcción de las primeras redes neuronales del autor</w:t>
+            </w:r>
+          </w:p>
+        </w:tc>
+        <w:tc>
+          <w:tcPr>
+            <w:tcW w:type="dxa" w:w="2268"/>
+          </w:tcPr>
+          <w:p>
+            <w:r>
+              <w:rPr>
+                <w:b w:val="0"/>
+                <w:i w:val="0"/>
+                <w:sz w:val="18"/>
+              </w:rPr>
+              <w:t>Realizado; no forma parte del código entregado. Orientó la elección del grafo y la decisión de situar la red como última pieza</w:t>
+            </w:r>
+          </w:p>
+        </w:tc>
+      </w:tr>
+      <w:tr>
+        <w:tc>
+          <w:tcPr>
+            <w:tcW w:type="dxa" w:w="2268"/>
+          </w:tcPr>
+          <w:p>
+            <w:r>
+              <w:rPr>
+                <w:b w:val="0"/>
+                <w:i w:val="0"/>
+                <w:sz w:val="18"/>
+              </w:rPr>
               <w:t>F0</w:t>
             </w:r>
           </w:p>
@@ -2263,7 +2325,7 @@
                 <w:i w:val="0"/>
                 <w:sz w:val="18"/>
               </w:rPr>
-              <w:t>Febrero</w:t>
+              <w:t>Febrero de 2026</w:t>
             </w:r>
           </w:p>
         </w:tc>
@@ -2325,7 +2387,7 @@
                 <w:i w:val="0"/>
                 <w:sz w:val="18"/>
               </w:rPr>
-              <w:t>Febrero–abril</w:t>
+              <w:t>Febrero–abril de 2026</w:t>
             </w:r>
           </w:p>
         </w:tc>
@@ -2387,7 +2449,7 @@
                 <w:i w:val="0"/>
                 <w:sz w:val="18"/>
               </w:rPr>
-              <w:t>Abril–junio</w:t>
+              <w:t>Abril–junio de 2026</w:t>
             </w:r>
           </w:p>
         </w:tc>
@@ -2449,7 +2511,7 @@
                 <w:i w:val="0"/>
                 <w:sz w:val="18"/>
               </w:rPr>
-              <w:t>Junio–julio</w:t>
+              <w:t>Junio–julio de 2026</w:t>
             </w:r>
           </w:p>
         </w:tc>
@@ -2511,7 +2573,7 @@
                 <w:i w:val="0"/>
                 <w:sz w:val="18"/>
               </w:rPr>
-              <w:t>Julio</w:t>
+              <w:t>Julio de 2026</w:t>
             </w:r>
           </w:p>
         </w:tc>
@@ -2573,7 +2635,7 @@
                 <w:i w:val="0"/>
                 <w:sz w:val="18"/>
               </w:rPr>
-              <w:t>Agosto–septiembre</w:t>
+              <w:t>Agosto–septiembre de 2026</w:t>
             </w:r>
           </w:p>
         </w:tc>
@@ -2635,7 +2697,7 @@
                 <w:i w:val="0"/>
                 <w:sz w:val="18"/>
               </w:rPr>
-              <w:t>Septiembre</w:t>
+              <w:t>Septiembre de 2026</w:t>
             </w:r>
           </w:p>
         </w:tc>
@@ -2697,7 +2759,7 @@
                 <w:i w:val="0"/>
                 <w:sz w:val="18"/>
               </w:rPr>
-              <w:t>10–13 de septiembre</w:t>
+              <w:t>10–13 de septiembre de 2026</w:t>
             </w:r>
           </w:p>
         </w:tc>
@@ -2803,14 +2865,30 @@
           <w:b/>
           <w:i w:val="0"/>
         </w:rPr>
-        <w:t>[COMPLETAR — URL del repositorio de entrega]</w:t>
-      </w:r>
-      <w:r>
-        <w:rPr>
-          <w:b w:val="0"/>
-          <w:i w:val="0"/>
-        </w:rPr>
-        <w:t xml:space="preserve">. La revisión entregada lleva la etiqueta </w:t>
+        <w:t>https://github.com/kssose91/Quir-n</w:t>
+      </w:r>
+      <w:r>
+        <w:rPr>
+          <w:b w:val="0"/>
+          <w:i w:val="0"/>
+        </w:rPr>
+        <w:t xml:space="preserve"> (rama </w:t>
+      </w:r>
+      <w:r>
+        <w:rPr>
+          <w:rFonts w:ascii="Consolas" w:hAnsi="Consolas"/>
+          <w:b w:val="0"/>
+          <w:i w:val="0"/>
+          <w:sz w:val="18"/>
+        </w:rPr>
+        <w:t>main</w:t>
+      </w:r>
+      <w:r>
+        <w:rPr>
+          <w:b w:val="0"/>
+          <w:i w:val="0"/>
+        </w:rPr>
+        <w:t xml:space="preserve">). La revisión entregada lleva la etiqueta </w:t>
       </w:r>
       <w:r>
         <w:rPr>
@@ -4376,7 +4454,7 @@
           <w:b w:val="0"/>
           <w:i w:val="0"/>
         </w:rPr>
-        <w:t>Ese entrenamiento se excluyó del alcance final. Pesaron la preparación de un corpus propio revisado, que solo podía existir una vez construido el índice, el coste de iteración y el plazo disponible; para el desarrollo se dispuso de un portátil con una RTX 3060 de 6 GB y de dos estaciones adicionales con dos RTX 3090 accesibles por SSH, y ni el tiempo de corpus ni el de iteración cabían en el calendario junto con el cierre funcional. Como referencia de escala, el informe de Qwen2.5-Coder describe un entrenamiento continuado sobre más de 5,5 billones de tokens [23]; un ajuste mediante QLoRA [24] reduce las exigencias de memoria, pero sigue exigiendo un corpus etiquetado y una evaluación que demuestre mejora frente al modelo base. No se dispone de una comparación que muestre que una red propia rendiría mejor o peor, ni de un presupuesto medido del entrenamiento descartado.</w:t>
+        <w:t>Ese entrenamiento se excluyó del alcance final. Pesaron la preparación de un corpus propio revisado, que solo podía existir una vez construido el índice, el coste de iteración y el plazo disponible; para el desarrollo se dispuso de un portátil con una RTX 3060 de 6 GB y de una estación adicional con dos RTX 3090 de 24 GB accesible por SSH, y ni el tiempo de corpus ni el de iteración cabían en el calendario junto con el cierre funcional. Como referencia de escala, el informe de Qwen2.5-Coder describe un entrenamiento continuado sobre más de 5,5 billones de tokens [23]; un ajuste mediante QLoRA [24] reduce las exigencias de memoria, pero sigue exigiendo un corpus etiquetado y una evaluación que demuestre mejora frente al modelo base. No se dispone de una comparación que muestre que una red propia rendiría mejor o peor, ni de un presupuesto medido del entrenamiento descartado.</w:t>
       </w:r>
     </w:p>
     <w:p>
@@ -4491,7 +4569,7 @@
           <w:b w:val="0"/>
           <w:i w:val="0"/>
         </w:rPr>
-        <w:t>Portátil con RTX 3060 de 6 GB y 15 GiB de RAM utilizable, Linux (Arch) con servicios de usuario de systemd: equipo de desarrollo y de todas las pruebas registradas.</w:t>
+        <w:t>Portátil Razer Blade 15 (2021) con Intel Core i7-10750H, RTX 3060 de 6 GB y 16 GB de RAM (15 GiB utilizables), Linux (Arch) con servicios de usuario de systemd: equipo de desarrollo y de todas las pruebas registradas.</w:t>
       </w:r>
     </w:p>
     <w:p>
@@ -4506,7 +4584,7 @@
           <w:b w:val="0"/>
           <w:i w:val="0"/>
         </w:rPr>
-        <w:t>Dos estaciones de trabajo adicionales con dos RTX 3090, accesibles por SSH: disponibles; no se atribuyen resultados de entrenamiento.</w:t>
+        <w:t>Dos torres adicionales accesibles por SSH en la red local, ambas con Arch Linux: una estación con AMD Ryzen 9 9950X, 128 GB de RAM, dos RTX 3090 de 24 GB y 8 TB de almacenamiento NVMe, prevista para el entrenamiento de la red obrera; y una segunda torre con AMD Ryzen 7 9800X3D, 64 GB de RAM y 3 TB de almacenamiento NVMe, sin GPU dedicada, usada como servidor de apoyo. No se atribuyen resultados de entrenamiento a ninguna de las dos.</w:t>
       </w:r>
     </w:p>
     <w:p>
@@ -4804,7 +4882,7 @@
                 <w:i w:val="0"/>
                 <w:sz w:val="18"/>
               </w:rPr>
-              <w:t>[COMPLETAR — horas totales]</w:t>
+              <w:t>≈ 900 h</w:t>
             </w:r>
           </w:p>
         </w:tc>
@@ -4819,7 +4897,7 @@
                 <w:i w:val="0"/>
                 <w:sz w:val="18"/>
               </w:rPr>
-              <w:t>Trabajo del autor de febrero a septiembre de 2026; no han participado otras personas</w:t>
+              <w:t>Estimación del autor: unas 20 h semanales de febrero a septiembre de 2026 (≈ 740 h) más unas 150 h de estudio previo en diciembre de 2025 y enero de 2026 (grafos, Neo4j y primeras redes neuronales). No han participado otras personas</w:t>
             </w:r>
           </w:p>
         </w:tc>
@@ -4836,7 +4914,7 @@
                 <w:i w:val="0"/>
                 <w:sz w:val="18"/>
               </w:rPr>
-              <w:t>Equipo técnico: portátil con RTX 3060 de 6 GB y 15 GiB de RAM</w:t>
+              <w:t>Equipo técnico: portátil Razer Blade 15 (2021), i7-10750H, RTX 3060 de 6 GB, 16 GB de RAM</w:t>
             </w:r>
           </w:p>
         </w:tc>
@@ -4851,7 +4929,7 @@
                 <w:i w:val="0"/>
                 <w:sz w:val="18"/>
               </w:rPr>
-              <w:t>[COMPLETAR — valor de mercado] €</w:t>
+              <w:t>≈ 1 800 €</w:t>
             </w:r>
           </w:p>
         </w:tc>
@@ -4866,7 +4944,7 @@
                 <w:i w:val="0"/>
                 <w:sz w:val="18"/>
               </w:rPr>
-              <w:t>Equipo propio, no adquirido para el proyecto; en él se hicieron todas las pruebas registradas</w:t>
+              <w:t>Equipo propio, no adquirido para el proyecto; precio aproximado a nuevo. En él se hicieron todas las pruebas registradas</w:t>
             </w:r>
           </w:p>
         </w:tc>
@@ -4883,7 +4961,7 @@
                 <w:i w:val="0"/>
                 <w:sz w:val="18"/>
               </w:rPr>
-              <w:t>Equipo técnico: dos estaciones con dos RTX 3090</w:t>
+              <w:t>Equipo técnico: estación con Ryzen 9 9950X, 128 GB de RAM, dos RTX 3090 de 24 GB y 8 TB NVMe</w:t>
             </w:r>
           </w:p>
         </w:tc>
@@ -4898,7 +4976,7 @@
                 <w:i w:val="0"/>
                 <w:sz w:val="18"/>
               </w:rPr>
-              <w:t>[COMPLETAR — valor de mercado] €</w:t>
+              <w:t>≈ 5 600 €</w:t>
             </w:r>
           </w:p>
         </w:tc>
@@ -4913,7 +4991,54 @@
                 <w:i w:val="0"/>
                 <w:sz w:val="18"/>
               </w:rPr>
-              <w:t>Equipos propios accesibles por SSH; no se usaron para entrenar</w:t>
+              <w:t>Equipo propio accesible por SSH; valor aproximado a nuevo por componentes, con las RTX 3090 a su precio de lanzamiento. Prevista para entrenar la red obrera; no se usó para entrenar</w:t>
+            </w:r>
+          </w:p>
+        </w:tc>
+      </w:tr>
+      <w:tr>
+        <w:tc>
+          <w:tcPr>
+            <w:tcW w:type="dxa" w:w="3024"/>
+          </w:tcPr>
+          <w:p>
+            <w:r>
+              <w:rPr>
+                <w:b w:val="0"/>
+                <w:i w:val="0"/>
+                <w:sz w:val="18"/>
+              </w:rPr>
+              <w:t>Equipo técnico: torre con Ryzen 7 9800X3D, 64 GB de RAM y 3 TB NVMe, sin GPU dedicada</w:t>
+            </w:r>
+          </w:p>
+        </w:tc>
+        <w:tc>
+          <w:tcPr>
+            <w:tcW w:type="dxa" w:w="3024"/>
+          </w:tcPr>
+          <w:p>
+            <w:r>
+              <w:rPr>
+                <w:b w:val="0"/>
+                <w:i w:val="0"/>
+                <w:sz w:val="18"/>
+              </w:rPr>
+              <w:t>≈ 1 300 €</w:t>
+            </w:r>
+          </w:p>
+        </w:tc>
+        <w:tc>
+          <w:tcPr>
+            <w:tcW w:type="dxa" w:w="3024"/>
+          </w:tcPr>
+          <w:p>
+            <w:r>
+              <w:rPr>
+                <w:b w:val="0"/>
+                <w:i w:val="0"/>
+                <w:sz w:val="18"/>
+              </w:rPr>
+              <w:t>Equipo propio accesible por SSH; valor aproximado a nuevo por componentes. Servidor de apoyo</w:t>
             </w:r>
           </w:p>
         </w:tc>
@@ -4992,7 +5117,7 @@
                 <w:i w:val="0"/>
                 <w:sz w:val="18"/>
               </w:rPr>
-              <w:t>[COMPLETAR — gasto real por periodo] €</w:t>
+              <w:t>0 € imputados</w:t>
             </w:r>
           </w:p>
         </w:tc>
@@ -5007,7 +5132,7 @@
                 <w:i w:val="0"/>
                 <w:sz w:val="18"/>
               </w:rPr>
-              <w:t>Usadas como agentes conectados a Quirón y como apoyo al desarrollo; los servidores compatibles y Ollama no requieren suscripción</w:t>
+              <w:t>El autor dispone de Claude Max y ChatGPT Pro por motivos laborales; no se contrataron para el proyecto. Se usaron como agentes conectados a Quirón y como apoyo al desarrollo; los servidores compatibles y Ollama no requieren suscripción</w:t>
             </w:r>
           </w:p>
         </w:tc>
@@ -5133,7 +5258,7 @@
                 <w:i w:val="0"/>
                 <w:sz w:val="18"/>
               </w:rPr>
-              <w:t>[COMPLETAR — estimación, si se incluye]</w:t>
+              <w:t>No imputada</w:t>
             </w:r>
           </w:p>
         </w:tc>
@@ -5148,7 +5273,7 @@
                 <w:i w:val="0"/>
                 <w:sz w:val="18"/>
               </w:rPr>
-              <w:t>Coste de la inferencia local; no se ha medido el consumo</w:t>
+              <w:t>Inferencia local en equipos propios; no se ha medido el consumo</w:t>
             </w:r>
           </w:p>
         </w:tc>
@@ -5160,7 +5285,7 @@
           <w:b w:val="0"/>
           <w:i w:val="0"/>
         </w:rPr>
-        <w:t>No se presenta un coste total hasta completar las filas pendientes. La disponibilidad de software y pesos descargables no elimina las condiciones de licencia ni los costes operativos; la revisión de licencias de distribución acompaña al paquete.</w:t>
+        <w:t>El desembolso directamente imputable al proyecto es de 0 €: el equipo es propio y anterior al proyecto (valor aproximado a nuevo de 8 700 € en conjunto), el software y los pesos son libres, y las suscripciones no se contrataron para el trabajo. El coste real es el tiempo del autor, unas 900 horas. La disponibilidad de software y pesos descargables no elimina las condiciones de licencia ni los costes operativos; la revisión de licencias de distribución acompaña al paquete.</w:t>
       </w:r>
     </w:p>
     <w:p>
@@ -7317,7 +7442,7 @@
           <w:b w:val="0"/>
           <w:i w:val="0"/>
         </w:rPr>
-        <w:t>La decisión más difícil fue renunciar a entrenar la red obrera y cerrar con modelos preentrenados. La planificación lo había previsto sin saberlo: al poner la red como última pieza, el sistema tenía que ser útil sin ella, y lo es. Aprendí que el orden de las fases es una decisión de riesgo, no de calendario.</w:t>
+        <w:t>La decisión más difícil fue renunciar a entrenar la red obrera y cerrar con modelos preentrenados. Ya en diciembre y enero, al construir mis primeras redes neuronales por mi cuenta, había visto lo difícil que es producir algo realmente útil sin un hardware inmenso, y eso pesó en la decisión. La planificación lo había previsto sin saberlo: al poner la red como última pieza, el sistema tenía que ser útil sin ella, y lo es. Aprendí que el orden de las fases es una decisión de riesgo, no de calendario.</w:t>
       </w:r>
     </w:p>
     <w:p>
@@ -8257,7 +8382,23 @@
           <w:b w:val="0"/>
           <w:i w:val="0"/>
         </w:rPr>
-        <w:t xml:space="preserve"> repositorio de entrega [COMPLETAR — URL], revisión etiquetada </w:t>
+        <w:t xml:space="preserve"> repositorio de entrega https://github.com/kssose91/Quir-n, rama </w:t>
+      </w:r>
+      <w:r>
+        <w:rPr>
+          <w:rFonts w:ascii="Consolas" w:hAnsi="Consolas"/>
+          <w:b w:val="0"/>
+          <w:i w:val="0"/>
+          <w:sz w:val="18"/>
+        </w:rPr>
+        <w:t>main</w:t>
+      </w:r>
+      <w:r>
+        <w:rPr>
+          <w:b w:val="0"/>
+          <w:i w:val="0"/>
+        </w:rPr>
+        <w:t xml:space="preserve">, revisión etiquetada </w:t>
       </w:r>
       <w:r>
         <w:rPr>

</xml_diff>